<commit_message>
revising guidelines and a sample
</commit_message>
<xml_diff>
--- a/docs/Annotation Guidelines.docx
+++ b/docs/Annotation Guidelines.docx
@@ -32,7 +32,7 @@
           <w:szCs w:val="38"/>
           <w:lang w:val="en-GB"/>
         </w:rPr>
-        <w:t xml:space="preserve">Annotation Guidelines </w:t>
+        <w:t>Annotation Guidelines for Idea Discovery</w:t>
       </w:r>
       <w:r>
         <w:rPr>
@@ -43,7 +43,7 @@
           <w:szCs w:val="38"/>
           <w:lang w:val="en-GB"/>
         </w:rPr>
-        <w:t>for Idea Discovery</w:t>
+        <w:t xml:space="preserve"> in the Project </w:t>
       </w:r>
       <w:r>
         <w:rPr>
@@ -54,7 +54,7 @@
           <w:szCs w:val="38"/>
           <w:lang w:val="en-GB"/>
         </w:rPr>
-        <w:t xml:space="preserve"> in the Project </w:t>
+        <w:t>“</w:t>
       </w:r>
       <w:r>
         <w:rPr>
@@ -65,7 +65,7 @@
           <w:szCs w:val="38"/>
           <w:lang w:val="en-GB"/>
         </w:rPr>
-        <w:t>“</w:t>
+        <w:t>Worth the Pause</w:t>
       </w:r>
       <w:r>
         <w:rPr>
@@ -76,17 +76,6 @@
           <w:szCs w:val="38"/>
           <w:lang w:val="en-GB"/>
         </w:rPr>
-        <w:t>Worth the Pause</w:t>
-      </w:r>
-      <w:r>
-        <w:rPr>
-          <w:rFonts w:asciiTheme="majorBidi" w:hAnsiTheme="majorBidi" w:cstheme="majorBidi"/>
-          <w:b/>
-          <w:bCs/>
-          <w:sz w:val="38"/>
-          <w:szCs w:val="38"/>
-          <w:lang w:val="en-GB"/>
-        </w:rPr>
         <w:t>”</w:t>
       </w:r>
     </w:p>
@@ -138,6 +127,13 @@
           <w:lang w:val="en-GB"/>
         </w:rPr>
         <w:t>. It is written for annotators and for readers who need to evaluate or replicate the analysis.</w:t>
+      </w:r>
+      <w:r>
+        <w:rPr>
+          <w:rFonts w:asciiTheme="majorBidi" w:hAnsiTheme="majorBidi" w:cstheme="majorBidi"/>
+          <w:lang w:val="en-GB"/>
+        </w:rPr>
+        <w:t xml:space="preserve"> The guidelines at the moment may seem a bit too technical at the moment for someone not educated in SFL. A more non-SFL-expert-friendly version of the guidelines is being developed, in case SFL-expert annotators cannot be found to be trained. </w:t>
       </w:r>
     </w:p>
     <w:p>
@@ -964,7 +960,6 @@
           <w:szCs w:val="30"/>
           <w:lang w:val="en-GB"/>
         </w:rPr>
-        <w:lastRenderedPageBreak/>
         <w:t>3. Pauses and bursts</w:t>
       </w:r>
     </w:p>
@@ -1054,7 +1049,7 @@
           <w:rFonts w:asciiTheme="majorBidi" w:hAnsiTheme="majorBidi" w:cstheme="majorBidi"/>
           <w:lang w:val="en-GB"/>
         </w:rPr>
-        <w:t xml:space="preserve">  </w:t>
+        <w:t xml:space="preserve"> </w:t>
       </w:r>
       <w:r>
         <w:rPr>
@@ -1075,7 +1070,21 @@
           <w:rFonts w:asciiTheme="majorBidi" w:hAnsiTheme="majorBidi" w:cstheme="majorBidi"/>
           <w:lang w:val="en-GB"/>
         </w:rPr>
-        <w:t>No objectively established threshold exists (Barkaoui, 2019); two seconds is often used to exclude intervals attributable to typing (Wengelin, 2006), but in skilled writers shorter pauses can</w:t>
+        <w:t xml:space="preserve">No objectively established </w:t>
+      </w:r>
+      <w:r>
+        <w:rPr>
+          <w:rFonts w:asciiTheme="majorBidi" w:hAnsiTheme="majorBidi" w:cstheme="majorBidi"/>
+          <w:lang w:val="en-GB"/>
+        </w:rPr>
+        <w:t xml:space="preserve">pause </w:t>
+      </w:r>
+      <w:r>
+        <w:rPr>
+          <w:rFonts w:asciiTheme="majorBidi" w:hAnsiTheme="majorBidi" w:cstheme="majorBidi"/>
+          <w:lang w:val="en-GB"/>
+        </w:rPr>
+        <w:t>threshold exists (Barkaoui, 2019); two seconds is often used to exclude intervals attributable to typing (Wengelin, 2006), but in skilled writers shorter pauses can</w:t>
       </w:r>
       <w:r>
         <w:rPr>
@@ -1273,7 +1282,7 @@
             <wp:cNvGraphicFramePr/>
             <a:graphic xmlns:a="http://schemas.openxmlformats.org/drawingml/2006/main">
               <a:graphicData uri="http://schemas.openxmlformats.org/drawingml/2006/diagram">
-                <dgm:relIds xmlns:dgm="http://schemas.openxmlformats.org/drawingml/2006/diagram" xmlns:r="http://schemas.openxmlformats.org/officeDocument/2006/relationships" r:dm="rId7" r:lo="rId8" r:qs="rId9" r:cs="rId10"/>
+                <dgm:relIds xmlns:dgm="http://schemas.openxmlformats.org/drawingml/2006/diagram" xmlns:r="http://schemas.openxmlformats.org/officeDocument/2006/relationships" r:dm="rId8" r:lo="rId9" r:qs="rId10" r:cs="rId11"/>
               </a:graphicData>
             </a:graphic>
           </wp:inline>
@@ -1506,6 +1515,7 @@
           <w:szCs w:val="25"/>
           <w:lang w:val="en-GB"/>
         </w:rPr>
+        <w:lastRenderedPageBreak/>
         <w:t>4.</w:t>
       </w:r>
       <w:r>
@@ -1544,7 +1554,6 @@
           <w:rFonts w:asciiTheme="majorBidi" w:hAnsiTheme="majorBidi" w:cstheme="majorBidi"/>
           <w:lang w:val="en-GB"/>
         </w:rPr>
-        <w:lastRenderedPageBreak/>
         <w:t xml:space="preserve">In SFL, the experiential content of a clause is construed through the TRANSITIVITY system (Halliday &amp; Matthiessen, 2014). A clause represents a quantum of experience </w:t>
       </w:r>
       <w:r>
@@ -2146,7 +2155,7 @@
                 <w:szCs w:val="18"/>
                 <w:lang w:val="en-GB"/>
               </w:rPr>
-              <w:t>Carrier, Attribute; Token, Value</w:t>
+              <w:t>Carrier, Attribute</w:t>
             </w:r>
           </w:p>
         </w:tc>
@@ -2424,12 +2433,49 @@
     </w:p>
     <w:p>
       <w:pPr>
+        <w:pStyle w:val="ListParagraph"/>
+        <w:numPr>
+          <w:ilvl w:val="0"/>
+          <w:numId w:val="2"/>
+        </w:numPr>
         <w:spacing w:after="150" w:line="276" w:lineRule="auto"/>
         <w:rPr>
           <w:rFonts w:asciiTheme="majorBidi" w:hAnsiTheme="majorBidi" w:cstheme="majorBidi"/>
           <w:lang w:val="en-GB"/>
         </w:rPr>
       </w:pPr>
+      <w:r>
+        <w:rPr>
+          <w:rFonts w:asciiTheme="majorBidi" w:hAnsiTheme="majorBidi" w:cstheme="majorBidi"/>
+          <w:b/>
+          <w:bCs/>
+          <w:lang w:val="en-GB"/>
+        </w:rPr>
+        <w:t>Embedded clauses</w:t>
+      </w:r>
+      <w:r>
+        <w:rPr>
+          <w:rFonts w:asciiTheme="majorBidi" w:hAnsiTheme="majorBidi" w:cstheme="majorBidi"/>
+          <w:b/>
+          <w:bCs/>
+          <w:lang w:val="en-GB"/>
+        </w:rPr>
+        <w:t>:</w:t>
+      </w:r>
+      <w:r>
+        <w:rPr>
+          <w:rFonts w:asciiTheme="majorBidi" w:hAnsiTheme="majorBidi" w:cstheme="majorBidi"/>
+          <w:lang w:val="en-GB"/>
+        </w:rPr>
+        <w:t xml:space="preserve"> A rankshifted clause does not construe a separate figure; it functions as a Participant, or as part of one, within the figure of its host clause. </w:t>
+      </w:r>
+      <w:r>
+        <w:rPr>
+          <w:rFonts w:asciiTheme="majorBidi" w:hAnsiTheme="majorBidi" w:cstheme="majorBidi"/>
+          <w:lang w:val="en-GB"/>
+        </w:rPr>
+        <w:t xml:space="preserve">For example in </w:t>
+      </w:r>
       <w:r>
         <w:rPr>
           <w:rFonts w:asciiTheme="majorBidi" w:hAnsiTheme="majorBidi" w:cstheme="majorBidi"/>
@@ -2437,14 +2483,7 @@
           <w:iCs/>
           <w:lang w:val="en-GB"/>
         </w:rPr>
-        <w:t>Embedded clauses.</w:t>
-      </w:r>
-      <w:r>
-        <w:rPr>
-          <w:rFonts w:asciiTheme="majorBidi" w:hAnsiTheme="majorBidi" w:cstheme="majorBidi"/>
-          <w:lang w:val="en-GB"/>
-        </w:rPr>
-        <w:t xml:space="preserve"> A rankshifted clause does not construe a separate figure; it functions as a Participant, or as part of one, within the figure of its host clause. In O10, </w:t>
+        <w:t>online is a much better platform</w:t>
       </w:r>
       <w:r>
         <w:rPr>
@@ -2453,14 +2492,7 @@
           <w:iCs/>
           <w:lang w:val="en-GB"/>
         </w:rPr>
-        <w:t>for finding someone exactly to your liking</w:t>
-      </w:r>
-      <w:r>
-        <w:rPr>
-          <w:rFonts w:asciiTheme="majorBidi" w:hAnsiTheme="majorBidi" w:cstheme="majorBidi"/>
-          <w:lang w:val="en-GB"/>
-        </w:rPr>
-        <w:t xml:space="preserve"> qualifies </w:t>
+        <w:t xml:space="preserve"> </w:t>
       </w:r>
       <w:r>
         <w:rPr>
@@ -2469,23 +2501,70 @@
           <w:iCs/>
           <w:lang w:val="en-GB"/>
         </w:rPr>
-        <w:t>platform</w:t>
-      </w:r>
-      <w:r>
-        <w:rPr>
-          <w:rFonts w:asciiTheme="majorBidi" w:hAnsiTheme="majorBidi" w:cstheme="majorBidi"/>
-          <w:lang w:val="en-GB"/>
-        </w:rPr>
-        <w:t xml:space="preserve"> and is part of the Attribute of the relational figure </w:t>
-      </w:r>
-      <w:r>
-        <w:rPr>
-          <w:rFonts w:asciiTheme="majorBidi" w:hAnsiTheme="majorBidi" w:cstheme="majorBidi"/>
+        <w:t>for finding someone exactly to your liking</w:t>
+      </w:r>
+      <w:r>
+        <w:rPr>
+          <w:rFonts w:asciiTheme="majorBidi" w:hAnsiTheme="majorBidi" w:cstheme="majorBidi"/>
+          <w:lang w:val="en-GB"/>
+        </w:rPr>
+        <w:t xml:space="preserve">, </w:t>
+      </w:r>
+      <w:r>
+        <w:rPr>
+          <w:rFonts w:asciiTheme="majorBidi" w:hAnsiTheme="majorBidi" w:cstheme="majorBidi"/>
+          <w:b/>
+          <w:bCs/>
           <w:i/>
           <w:iCs/>
           <w:lang w:val="en-GB"/>
         </w:rPr>
-        <w:t>online is a much better platform…</w:t>
+        <w:t>for finding someone exactly to your liking</w:t>
+      </w:r>
+      <w:r>
+        <w:rPr>
+          <w:rFonts w:asciiTheme="majorBidi" w:hAnsiTheme="majorBidi" w:cstheme="majorBidi"/>
+          <w:lang w:val="en-GB"/>
+        </w:rPr>
+        <w:t xml:space="preserve"> qualifies </w:t>
+      </w:r>
+      <w:r>
+        <w:rPr>
+          <w:rFonts w:asciiTheme="majorBidi" w:hAnsiTheme="majorBidi" w:cstheme="majorBidi"/>
+          <w:b/>
+          <w:bCs/>
+          <w:i/>
+          <w:iCs/>
+          <w:lang w:val="en-GB"/>
+        </w:rPr>
+        <w:t>platform</w:t>
+      </w:r>
+      <w:r>
+        <w:rPr>
+          <w:rFonts w:asciiTheme="majorBidi" w:hAnsiTheme="majorBidi" w:cstheme="majorBidi"/>
+          <w:lang w:val="en-GB"/>
+        </w:rPr>
+        <w:t xml:space="preserve"> and is part of the Attribute of the relational figure </w:t>
+      </w:r>
+      <w:r>
+        <w:rPr>
+          <w:rFonts w:asciiTheme="majorBidi" w:hAnsiTheme="majorBidi" w:cstheme="majorBidi"/>
+          <w:b/>
+          <w:bCs/>
+          <w:i/>
+          <w:iCs/>
+          <w:lang w:val="en-GB"/>
+        </w:rPr>
+        <w:t>online is a much better platform</w:t>
+      </w:r>
+      <w:r>
+        <w:rPr>
+          <w:rFonts w:asciiTheme="majorBidi" w:hAnsiTheme="majorBidi" w:cstheme="majorBidi"/>
+          <w:i/>
+          <w:iCs/>
+          <w:lang w:val="en-GB"/>
+        </w:rPr>
+        <w:t>…</w:t>
       </w:r>
       <w:r>
         <w:rPr>
@@ -2493,6 +2572,280 @@
           <w:lang w:val="en-GB"/>
         </w:rPr>
         <w:t>. It is part of that element.</w:t>
+      </w:r>
+    </w:p>
+    <w:p>
+      <w:pPr>
+        <w:pStyle w:val="ListParagraph"/>
+        <w:numPr>
+          <w:ilvl w:val="0"/>
+          <w:numId w:val="2"/>
+        </w:numPr>
+        <w:spacing w:after="150" w:line="276" w:lineRule="auto"/>
+        <w:rPr>
+          <w:rFonts w:asciiTheme="majorBidi" w:hAnsiTheme="majorBidi" w:cstheme="majorBidi"/>
+          <w:lang w:val="en-GB"/>
+        </w:rPr>
+      </w:pPr>
+      <w:r>
+        <w:rPr>
+          <w:rFonts w:asciiTheme="majorBidi" w:hAnsiTheme="majorBidi" w:cstheme="majorBidi"/>
+          <w:b/>
+          <w:bCs/>
+          <w:lang w:val="en-GB"/>
+        </w:rPr>
+        <w:t>Projecting clauses with the writer as source</w:t>
+      </w:r>
+      <w:r>
+        <w:rPr>
+          <w:rFonts w:asciiTheme="majorBidi" w:hAnsiTheme="majorBidi" w:cstheme="majorBidi"/>
+          <w:b/>
+          <w:bCs/>
+          <w:lang w:val="en-GB"/>
+        </w:rPr>
+        <w:t>:</w:t>
+      </w:r>
+      <w:r>
+        <w:rPr>
+          <w:rFonts w:asciiTheme="majorBidi" w:hAnsiTheme="majorBidi" w:cstheme="majorBidi"/>
+          <w:lang w:val="en-GB"/>
+        </w:rPr>
+        <w:t xml:space="preserve"> When a mental or verbal clause projects another </w:t>
+      </w:r>
+      <w:r>
+        <w:rPr>
+          <w:rFonts w:asciiTheme="majorBidi" w:hAnsiTheme="majorBidi" w:cstheme="majorBidi"/>
+          <w:lang w:val="en-GB"/>
+        </w:rPr>
+        <w:t xml:space="preserve">(e.g. </w:t>
+      </w:r>
+      <w:r>
+        <w:rPr>
+          <w:rFonts w:asciiTheme="majorBidi" w:hAnsiTheme="majorBidi" w:cstheme="majorBidi"/>
+          <w:i/>
+          <w:iCs/>
+          <w:lang w:val="en-GB"/>
+        </w:rPr>
+        <w:t>I argue that…</w:t>
+      </w:r>
+      <w:r>
+        <w:rPr>
+          <w:rFonts w:asciiTheme="majorBidi" w:hAnsiTheme="majorBidi" w:cstheme="majorBidi"/>
+          <w:lang w:val="en-GB"/>
+        </w:rPr>
+        <w:t xml:space="preserve">, </w:t>
+      </w:r>
+      <w:r>
+        <w:rPr>
+          <w:rFonts w:asciiTheme="majorBidi" w:hAnsiTheme="majorBidi" w:cstheme="majorBidi"/>
+          <w:i/>
+          <w:iCs/>
+          <w:lang w:val="en-GB"/>
+        </w:rPr>
+        <w:t>I believe…</w:t>
+      </w:r>
+      <w:r>
+        <w:rPr>
+          <w:rFonts w:asciiTheme="majorBidi" w:hAnsiTheme="majorBidi" w:cstheme="majorBidi"/>
+          <w:lang w:val="en-GB"/>
+        </w:rPr>
+        <w:t xml:space="preserve">, </w:t>
+      </w:r>
+      <w:r>
+        <w:rPr>
+          <w:rFonts w:asciiTheme="majorBidi" w:hAnsiTheme="majorBidi" w:cstheme="majorBidi"/>
+          <w:i/>
+          <w:iCs/>
+          <w:lang w:val="en-GB"/>
+        </w:rPr>
+        <w:t>it must be mentioned that…</w:t>
+      </w:r>
+      <w:r>
+        <w:rPr>
+          <w:rFonts w:asciiTheme="majorBidi" w:hAnsiTheme="majorBidi" w:cstheme="majorBidi"/>
+          <w:lang w:val="en-GB"/>
+        </w:rPr>
+        <w:t>)</w:t>
+      </w:r>
+      <w:r>
+        <w:rPr>
+          <w:rFonts w:asciiTheme="majorBidi" w:hAnsiTheme="majorBidi" w:cstheme="majorBidi"/>
+          <w:lang w:val="en-GB"/>
+        </w:rPr>
+        <w:t xml:space="preserve"> and the Senser or Sayer is the writer, the projecting clause does not construe content about the topic</w:t>
+      </w:r>
+      <w:r>
+        <w:rPr>
+          <w:rFonts w:asciiTheme="majorBidi" w:hAnsiTheme="majorBidi" w:cstheme="majorBidi"/>
+          <w:lang w:val="en-GB"/>
+        </w:rPr>
+        <w:t>;</w:t>
+      </w:r>
+      <w:r>
+        <w:rPr>
+          <w:rFonts w:asciiTheme="majorBidi" w:hAnsiTheme="majorBidi" w:cstheme="majorBidi"/>
+          <w:lang w:val="en-GB"/>
+        </w:rPr>
+        <w:t xml:space="preserve"> it presents the projected content as the writer’s own. The projected clause is annotated as the element and the projecting clause is not. Where the source is someone other than the writer (</w:t>
+      </w:r>
+      <w:r>
+        <w:rPr>
+          <w:rFonts w:asciiTheme="majorBidi" w:hAnsiTheme="majorBidi" w:cstheme="majorBidi"/>
+          <w:i/>
+          <w:iCs/>
+          <w:lang w:val="en-GB"/>
+        </w:rPr>
+        <w:t>critics claim that…</w:t>
+      </w:r>
+      <w:r>
+        <w:rPr>
+          <w:rFonts w:asciiTheme="majorBidi" w:hAnsiTheme="majorBidi" w:cstheme="majorBidi"/>
+          <w:lang w:val="en-GB"/>
+        </w:rPr>
+        <w:t>), the attribution is part of what the writer asserts, and both clauses are annotated.</w:t>
+      </w:r>
+    </w:p>
+    <w:p>
+      <w:pPr>
+        <w:pStyle w:val="ListParagraph"/>
+        <w:numPr>
+          <w:ilvl w:val="0"/>
+          <w:numId w:val="2"/>
+        </w:numPr>
+        <w:spacing w:after="150" w:line="276" w:lineRule="auto"/>
+        <w:rPr>
+          <w:rFonts w:asciiTheme="majorBidi" w:hAnsiTheme="majorBidi" w:cstheme="majorBidi"/>
+          <w:lang w:val="en-GB"/>
+        </w:rPr>
+      </w:pPr>
+      <w:r>
+        <w:rPr>
+          <w:rFonts w:asciiTheme="majorBidi" w:hAnsiTheme="majorBidi" w:cstheme="majorBidi"/>
+          <w:b/>
+          <w:bCs/>
+          <w:lang w:val="en-GB"/>
+        </w:rPr>
+        <w:t>Clauses about the writer’s own text</w:t>
+      </w:r>
+      <w:r>
+        <w:rPr>
+          <w:rFonts w:asciiTheme="majorBidi" w:hAnsiTheme="majorBidi" w:cstheme="majorBidi"/>
+          <w:b/>
+          <w:bCs/>
+          <w:lang w:val="en-GB"/>
+        </w:rPr>
+        <w:t>:</w:t>
+      </w:r>
+      <w:r>
+        <w:rPr>
+          <w:rFonts w:asciiTheme="majorBidi" w:hAnsiTheme="majorBidi" w:cstheme="majorBidi"/>
+          <w:lang w:val="en-GB"/>
+        </w:rPr>
+        <w:t xml:space="preserve"> A clause in which the writer is Actor, Senser or Sayer and the Goal, Phenomenon or Verbiage is the text itself or a part of it </w:t>
+      </w:r>
+      <w:r>
+        <w:rPr>
+          <w:rFonts w:asciiTheme="majorBidi" w:hAnsiTheme="majorBidi" w:cstheme="majorBidi"/>
+          <w:lang w:val="en-GB"/>
+        </w:rPr>
+        <w:t>(</w:t>
+      </w:r>
+      <w:r>
+        <w:rPr>
+          <w:rFonts w:asciiTheme="majorBidi" w:hAnsiTheme="majorBidi" w:cstheme="majorBidi"/>
+          <w:i/>
+          <w:iCs/>
+          <w:lang w:val="en-GB"/>
+        </w:rPr>
+        <w:t>we will define some of the key terms used throughout the essay</w:t>
+      </w:r>
+      <w:r>
+        <w:rPr>
+          <w:rFonts w:asciiTheme="majorBidi" w:hAnsiTheme="majorBidi" w:cstheme="majorBidi"/>
+          <w:lang w:val="en-GB"/>
+        </w:rPr>
+        <w:t xml:space="preserve">, </w:t>
+      </w:r>
+      <w:r>
+        <w:rPr>
+          <w:rFonts w:asciiTheme="majorBidi" w:hAnsiTheme="majorBidi" w:cstheme="majorBidi"/>
+          <w:i/>
+          <w:iCs/>
+          <w:lang w:val="en-GB"/>
+        </w:rPr>
+        <w:t>we will now consider some of the reasons</w:t>
+      </w:r>
+      <w:r>
+        <w:rPr>
+          <w:rFonts w:asciiTheme="majorBidi" w:hAnsiTheme="majorBidi" w:cstheme="majorBidi"/>
+          <w:lang w:val="en-GB"/>
+        </w:rPr>
+        <w:t>)</w:t>
+      </w:r>
+      <w:r>
+        <w:rPr>
+          <w:rFonts w:asciiTheme="majorBidi" w:hAnsiTheme="majorBidi" w:cstheme="majorBidi"/>
+          <w:lang w:val="en-GB"/>
+        </w:rPr>
+        <w:t xml:space="preserve"> organises the text rather than construing its content, and is not annotated, for the same reason as a writer-projecting clause. The criterion is the participant, not the writer’s presence: </w:t>
+      </w:r>
+      <w:r>
+        <w:rPr>
+          <w:rFonts w:asciiTheme="majorBidi" w:hAnsiTheme="majorBidi" w:cstheme="majorBidi"/>
+          <w:i/>
+          <w:iCs/>
+          <w:lang w:val="en-GB"/>
+        </w:rPr>
+        <w:t>we will consider both casual and serious dating</w:t>
+      </w:r>
+      <w:r>
+        <w:rPr>
+          <w:rFonts w:asciiTheme="majorBidi" w:hAnsiTheme="majorBidi" w:cstheme="majorBidi"/>
+          <w:lang w:val="en-GB"/>
+        </w:rPr>
+        <w:t xml:space="preserve"> has the topic as its Phenomenon and is annotated.</w:t>
+      </w:r>
+    </w:p>
+    <w:p>
+      <w:pPr>
+        <w:spacing w:before="210" w:after="100"/>
+        <w:rPr>
+          <w:rFonts w:asciiTheme="majorBidi" w:hAnsiTheme="majorBidi" w:cstheme="majorBidi"/>
+          <w:lang w:val="en-GB"/>
+        </w:rPr>
+      </w:pPr>
+      <w:r>
+        <w:rPr>
+          <w:rFonts w:asciiTheme="majorBidi" w:hAnsiTheme="majorBidi" w:cstheme="majorBidi"/>
+          <w:b/>
+          <w:bCs/>
+          <w:i/>
+          <w:iCs/>
+          <w:lang w:val="en-GB"/>
+        </w:rPr>
+        <w:t>4.</w:t>
+      </w:r>
+      <w:r>
+        <w:rPr>
+          <w:rFonts w:asciiTheme="majorBidi" w:hAnsiTheme="majorBidi" w:cstheme="majorBidi"/>
+          <w:b/>
+          <w:bCs/>
+          <w:i/>
+          <w:iCs/>
+          <w:lang w:val="en-GB"/>
+        </w:rPr>
+        <w:t>1</w:t>
+      </w:r>
+      <w:r>
+        <w:rPr>
+          <w:rFonts w:asciiTheme="majorBidi" w:hAnsiTheme="majorBidi" w:cstheme="majorBidi"/>
+          <w:b/>
+          <w:bCs/>
+          <w:i/>
+          <w:iCs/>
+          <w:lang w:val="en-GB"/>
+        </w:rPr>
+        <w:t>.3 When two elements have the same content</w:t>
       </w:r>
     </w:p>
     <w:p>
@@ -2506,34 +2859,33 @@
       <w:r>
         <w:rPr>
           <w:rFonts w:asciiTheme="majorBidi" w:hAnsiTheme="majorBidi" w:cstheme="majorBidi"/>
-          <w:i/>
-          <w:iCs/>
-          <w:lang w:val="en-GB"/>
-        </w:rPr>
-        <w:t>Projecting clauses with the writer as source.</w:t>
-      </w:r>
-      <w:r>
-        <w:rPr>
-          <w:rFonts w:asciiTheme="majorBidi" w:hAnsiTheme="majorBidi" w:cstheme="majorBidi"/>
-          <w:lang w:val="en-GB"/>
-        </w:rPr>
-        <w:t xml:space="preserve"> When a mental or verbal clause projects another </w:t>
-      </w:r>
-      <w:r>
-        <w:rPr>
-          <w:rFonts w:asciiTheme="majorBidi" w:hAnsiTheme="majorBidi" w:cstheme="majorBidi"/>
-          <w:lang w:val="en-GB"/>
-        </w:rPr>
-        <w:t xml:space="preserve">(e.g. </w:t>
-      </w:r>
-      <w:r>
-        <w:rPr>
-          <w:rFonts w:asciiTheme="majorBidi" w:hAnsiTheme="majorBidi" w:cstheme="majorBidi"/>
-          <w:i/>
-          <w:iCs/>
-          <w:lang w:val="en-GB"/>
-        </w:rPr>
-        <w:t>I argue that…</w:t>
+          <w:lang w:val="en-GB"/>
+        </w:rPr>
+        <w:lastRenderedPageBreak/>
+        <w:t xml:space="preserve">The content of an element is identified by its </w:t>
+      </w:r>
+      <w:r>
+        <w:rPr>
+          <w:rFonts w:asciiTheme="majorBidi" w:hAnsiTheme="majorBidi" w:cstheme="majorBidi"/>
+          <w:b/>
+          <w:bCs/>
+          <w:lang w:val="en-GB"/>
+        </w:rPr>
+        <w:t>experiential nucleus</w:t>
+      </w:r>
+      <w:r>
+        <w:rPr>
+          <w:rFonts w:asciiTheme="majorBidi" w:hAnsiTheme="majorBidi" w:cstheme="majorBidi"/>
+          <w:lang w:val="en-GB"/>
+        </w:rPr>
+        <w:t>, meaning</w:t>
+      </w:r>
+      <w:r>
+        <w:rPr>
+          <w:rFonts w:asciiTheme="majorBidi" w:hAnsiTheme="majorBidi" w:cstheme="majorBidi"/>
+          <w:lang w:val="en-GB"/>
+        </w:rPr>
+        <w:t xml:space="preserve"> its Process together with its Participants. SFL distinguishes the nucleus of a figure, whose participants are inherent to the process, from its circumstantial periphery (Halliday &amp; Matthiessen, 2014). Two elements realise the same content when they construe the same Process</w:t>
       </w:r>
       <w:r>
         <w:rPr>
@@ -2545,11 +2897,9 @@
       <w:r>
         <w:rPr>
           <w:rFonts w:asciiTheme="majorBidi" w:hAnsiTheme="majorBidi" w:cstheme="majorBidi"/>
-          <w:i/>
-          <w:iCs/>
-          <w:lang w:val="en-GB"/>
-        </w:rPr>
-        <w:t>I believe…</w:t>
+          <w:lang w:val="en-GB"/>
+        </w:rPr>
+        <w:t>the same process type and experiential meaning</w:t>
       </w:r>
       <w:r>
         <w:rPr>
@@ -2561,41 +2911,9 @@
       <w:r>
         <w:rPr>
           <w:rFonts w:asciiTheme="majorBidi" w:hAnsiTheme="majorBidi" w:cstheme="majorBidi"/>
-          <w:i/>
-          <w:iCs/>
-          <w:lang w:val="en-GB"/>
-        </w:rPr>
-        <w:t>it must be mentioned that…</w:t>
-      </w:r>
-      <w:r>
-        <w:rPr>
-          <w:rFonts w:asciiTheme="majorBidi" w:hAnsiTheme="majorBidi" w:cstheme="majorBidi"/>
-          <w:lang w:val="en-GB"/>
-        </w:rPr>
-        <w:t>)</w:t>
-      </w:r>
-      <w:r>
-        <w:rPr>
-          <w:rFonts w:asciiTheme="majorBidi" w:hAnsiTheme="majorBidi" w:cstheme="majorBidi"/>
-          <w:lang w:val="en-GB"/>
-        </w:rPr>
-        <w:t xml:space="preserve"> and the Senser or Sayer is the writer, the projecting clause does not construe content about the topic: it presents the projected content as the writer’s own. The projected clause is annotated as the element and the projecting clause is not. Where the source is someone other than the writer (</w:t>
-      </w:r>
-      <w:r>
-        <w:rPr>
-          <w:rFonts w:asciiTheme="majorBidi" w:hAnsiTheme="majorBidi" w:cstheme="majorBidi"/>
-          <w:i/>
-          <w:iCs/>
-          <w:lang w:val="en-GB"/>
-        </w:rPr>
-        <w:t>critics claim that…</w:t>
-      </w:r>
-      <w:r>
-        <w:rPr>
-          <w:rFonts w:asciiTheme="majorBidi" w:hAnsiTheme="majorBidi" w:cstheme="majorBidi"/>
-          <w:lang w:val="en-GB"/>
-        </w:rPr>
-        <w:t>), the attribution is part of what the writer asserts, and both clauses are annotated.</w:t>
+          <w:lang w:val="en-GB"/>
+        </w:rPr>
+        <w:t>with Participants that have the same referents in the same roles.</w:t>
       </w:r>
     </w:p>
     <w:p>
@@ -2609,25 +2927,39 @@
       <w:r>
         <w:rPr>
           <w:rFonts w:asciiTheme="majorBidi" w:hAnsiTheme="majorBidi" w:cstheme="majorBidi"/>
+          <w:lang w:val="en-GB"/>
+        </w:rPr>
+        <w:t xml:space="preserve">Identity does not depend on wording, voice, tense or modality. </w:t>
+      </w:r>
+      <w:r>
+        <w:rPr>
+          <w:rFonts w:asciiTheme="majorBidi" w:hAnsiTheme="majorBidi" w:cstheme="majorBidi"/>
+          <w:lang w:val="en-GB"/>
+        </w:rPr>
+        <w:t>For example</w:t>
+      </w:r>
+      <w:r>
+        <w:rPr>
+          <w:rFonts w:asciiTheme="majorBidi" w:hAnsiTheme="majorBidi" w:cstheme="majorBidi"/>
+          <w:lang w:val="en-GB"/>
+        </w:rPr>
+        <w:t xml:space="preserve">, </w:t>
+      </w:r>
+      <w:r>
+        <w:rPr>
+          <w:rFonts w:asciiTheme="majorBidi" w:hAnsiTheme="majorBidi" w:cstheme="majorBidi"/>
           <w:i/>
           <w:iCs/>
           <w:lang w:val="en-GB"/>
         </w:rPr>
-        <w:t>Clauses about the writer’s own text.</w:t>
-      </w:r>
-      <w:r>
-        <w:rPr>
-          <w:rFonts w:asciiTheme="majorBidi" w:hAnsiTheme="majorBidi" w:cstheme="majorBidi"/>
-          <w:lang w:val="en-GB"/>
-        </w:rPr>
-        <w:t xml:space="preserve"> A clause in which the writer is Actor, Senser or Sayer and the Goal, Phenomenon or Verbiage is the text itself or a part of it </w:t>
-      </w:r>
-      <w:r>
-        <w:rPr>
-          <w:rFonts w:asciiTheme="majorBidi" w:hAnsiTheme="majorBidi" w:cstheme="majorBidi"/>
-          <w:lang w:val="en-GB"/>
-        </w:rPr>
-        <w:t>(</w:t>
+        <w:t>the norms around dating differ</w:t>
+      </w:r>
+      <w:r>
+        <w:rPr>
+          <w:rFonts w:asciiTheme="majorBidi" w:hAnsiTheme="majorBidi" w:cstheme="majorBidi"/>
+          <w:lang w:val="en-GB"/>
+        </w:rPr>
+        <w:t xml:space="preserve">, and the text’s </w:t>
       </w:r>
       <w:r>
         <w:rPr>
@@ -2636,14 +2968,28 @@
           <w:iCs/>
           <w:lang w:val="en-GB"/>
         </w:rPr>
-        <w:t>we will define some of the key terms used throughout the essay</w:t>
-      </w:r>
-      <w:r>
-        <w:rPr>
-          <w:rFonts w:asciiTheme="majorBidi" w:hAnsiTheme="majorBidi" w:cstheme="majorBidi"/>
-          <w:lang w:val="en-GB"/>
-        </w:rPr>
-        <w:t xml:space="preserve">, </w:t>
+        <w:t>conventions around dating norms differ</w:t>
+      </w:r>
+      <w:r>
+        <w:rPr>
+          <w:rFonts w:asciiTheme="majorBidi" w:hAnsiTheme="majorBidi" w:cstheme="majorBidi"/>
+          <w:lang w:val="en-GB"/>
+        </w:rPr>
+        <w:t xml:space="preserve"> construe the same figure with the same Carrier. Modality grades the writer’s commitment to a figure without changing it</w:t>
+      </w:r>
+      <w:r>
+        <w:rPr>
+          <w:rFonts w:asciiTheme="majorBidi" w:hAnsiTheme="majorBidi" w:cstheme="majorBidi"/>
+          <w:lang w:val="en-GB"/>
+        </w:rPr>
+        <w:t>; for example,</w:t>
+      </w:r>
+      <w:r>
+        <w:rPr>
+          <w:rFonts w:asciiTheme="majorBidi" w:hAnsiTheme="majorBidi" w:cstheme="majorBidi"/>
+          <w:lang w:val="en-GB"/>
+        </w:rPr>
+        <w:t xml:space="preserve"> </w:t>
       </w:r>
       <w:r>
         <w:rPr>
@@ -2652,21 +2998,14 @@
           <w:iCs/>
           <w:lang w:val="en-GB"/>
         </w:rPr>
-        <w:t>we will now consider some of the reasons</w:t>
-      </w:r>
-      <w:r>
-        <w:rPr>
-          <w:rFonts w:asciiTheme="majorBidi" w:hAnsiTheme="majorBidi" w:cstheme="majorBidi"/>
-          <w:lang w:val="en-GB"/>
-        </w:rPr>
-        <w:t>)</w:t>
-      </w:r>
-      <w:r>
-        <w:rPr>
-          <w:rFonts w:asciiTheme="majorBidi" w:hAnsiTheme="majorBidi" w:cstheme="majorBidi"/>
-          <w:lang w:val="en-GB"/>
-        </w:rPr>
-        <w:t xml:space="preserve"> organises the text rather than construing its content, and is not annotated, for the same reason as a writer-projecting clause. The criterion is the participant, not the writer’s presence: </w:t>
+        <w:t>online dating might be a better option</w:t>
+      </w:r>
+      <w:r>
+        <w:rPr>
+          <w:rFonts w:asciiTheme="majorBidi" w:hAnsiTheme="majorBidi" w:cstheme="majorBidi"/>
+          <w:lang w:val="en-GB"/>
+        </w:rPr>
+        <w:t xml:space="preserve"> and </w:t>
       </w:r>
       <w:r>
         <w:rPr>
@@ -2675,14 +3014,143 @@
           <w:iCs/>
           <w:lang w:val="en-GB"/>
         </w:rPr>
-        <w:t>we will consider both casual and serious dating</w:t>
-      </w:r>
-      <w:r>
-        <w:rPr>
-          <w:rFonts w:asciiTheme="majorBidi" w:hAnsiTheme="majorBidi" w:cstheme="majorBidi"/>
-          <w:lang w:val="en-GB"/>
-        </w:rPr>
-        <w:t xml:space="preserve"> has the topic as its Phenomenon and is annotated.</w:t>
+        <w:t>online dating is a better option</w:t>
+      </w:r>
+      <w:r>
+        <w:rPr>
+          <w:rFonts w:asciiTheme="majorBidi" w:hAnsiTheme="majorBidi" w:cstheme="majorBidi"/>
+          <w:lang w:val="en-GB"/>
+        </w:rPr>
+        <w:t xml:space="preserve"> are the same content.</w:t>
+      </w:r>
+    </w:p>
+    <w:p>
+      <w:pPr>
+        <w:spacing w:after="150" w:line="276" w:lineRule="auto"/>
+        <w:rPr>
+          <w:rFonts w:asciiTheme="majorBidi" w:hAnsiTheme="majorBidi" w:cstheme="majorBidi"/>
+          <w:lang w:val="en-GB"/>
+        </w:rPr>
+      </w:pPr>
+      <w:r>
+        <w:rPr>
+          <w:rFonts w:asciiTheme="majorBidi" w:hAnsiTheme="majorBidi" w:cstheme="majorBidi"/>
+          <w:lang w:val="en-GB"/>
+        </w:rPr>
+        <w:t xml:space="preserve">Identity does depend on </w:t>
+      </w:r>
+      <w:r>
+        <w:rPr>
+          <w:rFonts w:asciiTheme="majorBidi" w:hAnsiTheme="majorBidi" w:cstheme="majorBidi"/>
+          <w:b/>
+          <w:bCs/>
+          <w:lang w:val="en-GB"/>
+        </w:rPr>
+        <w:t>polarity</w:t>
+      </w:r>
+      <w:r>
+        <w:rPr>
+          <w:rFonts w:asciiTheme="majorBidi" w:hAnsiTheme="majorBidi" w:cstheme="majorBidi"/>
+          <w:lang w:val="en-GB"/>
+        </w:rPr>
+        <w:t>. Polarity is not part of TRANSITIVITY but it determines what is asserted</w:t>
+      </w:r>
+      <w:r>
+        <w:rPr>
+          <w:rFonts w:asciiTheme="majorBidi" w:hAnsiTheme="majorBidi" w:cstheme="majorBidi"/>
+          <w:lang w:val="en-GB"/>
+        </w:rPr>
+        <w:t>;</w:t>
+      </w:r>
+      <w:r>
+        <w:rPr>
+          <w:rFonts w:asciiTheme="majorBidi" w:hAnsiTheme="majorBidi" w:cstheme="majorBidi"/>
+          <w:lang w:val="en-GB"/>
+        </w:rPr>
+        <w:t xml:space="preserve"> Elements with the same configuration and opposite polarity are different content. Otherwise</w:t>
+      </w:r>
+      <w:r>
+        <w:rPr>
+          <w:rFonts w:asciiTheme="majorBidi" w:hAnsiTheme="majorBidi" w:cstheme="majorBidi"/>
+          <w:lang w:val="en-GB"/>
+        </w:rPr>
+        <w:t>,</w:t>
+      </w:r>
+      <w:r>
+        <w:rPr>
+          <w:rFonts w:asciiTheme="majorBidi" w:hAnsiTheme="majorBidi" w:cstheme="majorBidi"/>
+          <w:lang w:val="en-GB"/>
+        </w:rPr>
+        <w:t xml:space="preserve"> a reversal of the writer’s plan would be coded as a restatement of it.</w:t>
+      </w:r>
+    </w:p>
+    <w:p>
+      <w:pPr>
+        <w:spacing w:after="150" w:line="276" w:lineRule="auto"/>
+        <w:rPr>
+          <w:rFonts w:asciiTheme="majorBidi" w:hAnsiTheme="majorBidi" w:cstheme="majorBidi"/>
+          <w:lang w:val="en-GB"/>
+        </w:rPr>
+      </w:pPr>
+      <w:r>
+        <w:rPr>
+          <w:rFonts w:asciiTheme="majorBidi" w:hAnsiTheme="majorBidi" w:cstheme="majorBidi"/>
+          <w:lang w:val="en-GB"/>
+        </w:rPr>
+        <w:t xml:space="preserve">Some registered elements leave a participant </w:t>
+      </w:r>
+      <w:r>
+        <w:rPr>
+          <w:rFonts w:asciiTheme="majorBidi" w:hAnsiTheme="majorBidi" w:cstheme="majorBidi"/>
+          <w:b/>
+          <w:bCs/>
+          <w:lang w:val="en-GB"/>
+        </w:rPr>
+        <w:t>unspecified</w:t>
+      </w:r>
+      <w:r>
+        <w:rPr>
+          <w:rFonts w:asciiTheme="majorBidi" w:hAnsiTheme="majorBidi" w:cstheme="majorBidi"/>
+          <w:lang w:val="en-GB"/>
+        </w:rPr>
+        <w:t xml:space="preserve">, </w:t>
+      </w:r>
+      <w:r>
+        <w:rPr>
+          <w:rFonts w:asciiTheme="majorBidi" w:hAnsiTheme="majorBidi" w:cstheme="majorBidi"/>
+          <w:lang w:val="en-GB"/>
+        </w:rPr>
+        <w:t>an outline question (</w:t>
+      </w:r>
+      <w:r>
+        <w:rPr>
+          <w:rFonts w:asciiTheme="majorBidi" w:hAnsiTheme="majorBidi" w:cstheme="majorBidi"/>
+          <w:i/>
+          <w:iCs/>
+          <w:lang w:val="en-GB"/>
+        </w:rPr>
+        <w:t>what do we mean by online dating</w:t>
+      </w:r>
+      <w:r>
+        <w:rPr>
+          <w:rFonts w:asciiTheme="majorBidi" w:hAnsiTheme="majorBidi" w:cstheme="majorBidi"/>
+          <w:lang w:val="en-GB"/>
+        </w:rPr>
+        <w:t>), or a nominalisation whose participants are unexpressed. An unspecified participant is matched by any specification of it</w:t>
+      </w:r>
+      <w:r>
+        <w:rPr>
+          <w:rFonts w:asciiTheme="majorBidi" w:hAnsiTheme="majorBidi" w:cstheme="majorBidi"/>
+          <w:lang w:val="en-GB"/>
+        </w:rPr>
+        <w:t>;</w:t>
+      </w:r>
+      <w:r>
+        <w:rPr>
+          <w:rFonts w:asciiTheme="majorBidi" w:hAnsiTheme="majorBidi" w:cstheme="majorBidi"/>
+          <w:lang w:val="en-GB"/>
+        </w:rPr>
+        <w:t xml:space="preserve"> a text element that supplies it realises the registered element. The registered figure already contains that participant role; the text fills the role rather than construing a different figure.</w:t>
       </w:r>
     </w:p>
     <w:p>
@@ -2724,7 +3192,7 @@
           <w:iCs/>
           <w:lang w:val="en-GB"/>
         </w:rPr>
-        <w:t>.3 When two elements have the same content</w:t>
+        <w:t>.4 Circumstances</w:t>
       </w:r>
     </w:p>
     <w:p>
@@ -2740,7 +3208,7 @@
           <w:rFonts w:asciiTheme="majorBidi" w:hAnsiTheme="majorBidi" w:cstheme="majorBidi"/>
           <w:lang w:val="en-GB"/>
         </w:rPr>
-        <w:t xml:space="preserve">The content of an element is identified by its </w:t>
+        <w:t xml:space="preserve">A circumstance is annotated as a </w:t>
       </w:r>
       <w:r>
         <w:rPr>
@@ -2749,22 +3217,51 @@
           <w:bCs/>
           <w:lang w:val="en-GB"/>
         </w:rPr>
-        <w:t>experiential nucleus</w:t>
-      </w:r>
-      <w:r>
-        <w:rPr>
-          <w:rFonts w:asciiTheme="majorBidi" w:hAnsiTheme="majorBidi" w:cstheme="majorBidi"/>
-          <w:lang w:val="en-GB"/>
-        </w:rPr>
-        <w:t xml:space="preserve">: its Process together with its Participants. SFL distinguishes the nucleus of a figure, whose participants are inherent to the process, from its </w:t>
-      </w:r>
-      <w:r>
-        <w:rPr>
-          <w:rFonts w:asciiTheme="majorBidi" w:hAnsiTheme="majorBidi" w:cstheme="majorBidi"/>
-          <w:lang w:val="en-GB"/>
-        </w:rPr>
-        <w:lastRenderedPageBreak/>
-        <w:t>circumstantial periphery (Halliday &amp; Matthiessen, 2014). Two elements realise the same content when they construe the same Process</w:t>
+        <w:t>relation</w:t>
+      </w:r>
+      <w:r>
+        <w:rPr>
+          <w:rFonts w:asciiTheme="majorBidi" w:hAnsiTheme="majorBidi" w:cstheme="majorBidi"/>
+          <w:lang w:val="en-GB"/>
+        </w:rPr>
+        <w:t xml:space="preserve"> when its complement construes a figure </w:t>
+      </w:r>
+      <w:r>
+        <w:rPr>
+          <w:rFonts w:asciiTheme="majorBidi" w:hAnsiTheme="majorBidi" w:cstheme="majorBidi"/>
+          <w:lang w:val="en-GB"/>
+        </w:rPr>
+        <w:t xml:space="preserve">(i.e. </w:t>
+      </w:r>
+      <w:r>
+        <w:rPr>
+          <w:rFonts w:asciiTheme="majorBidi" w:hAnsiTheme="majorBidi" w:cstheme="majorBidi"/>
+          <w:lang w:val="en-GB"/>
+        </w:rPr>
+        <w:t>an event, state or quality, typically realised as a nominalisation or an event noun</w:t>
+      </w:r>
+      <w:r>
+        <w:rPr>
+          <w:rFonts w:asciiTheme="majorBidi" w:hAnsiTheme="majorBidi" w:cstheme="majorBidi"/>
+          <w:lang w:val="en-GB"/>
+        </w:rPr>
+        <w:t>)</w:t>
+      </w:r>
+      <w:r>
+        <w:rPr>
+          <w:rFonts w:asciiTheme="majorBidi" w:hAnsiTheme="majorBidi" w:cstheme="majorBidi"/>
+          <w:lang w:val="en-GB"/>
+        </w:rPr>
+        <w:t xml:space="preserve"> so that it relates the figure of its clause to another. </w:t>
+      </w:r>
+      <w:r>
+        <w:rPr>
+          <w:rFonts w:asciiTheme="majorBidi" w:hAnsiTheme="majorBidi" w:cstheme="majorBidi"/>
+          <w:i/>
+          <w:iCs/>
+          <w:lang w:val="en-GB"/>
+        </w:rPr>
+        <w:t>Despite the ease and convenience presented by online methods</w:t>
       </w:r>
       <w:r>
         <w:rPr>
@@ -2776,23 +3273,66 @@
       <w:r>
         <w:rPr>
           <w:rFonts w:asciiTheme="majorBidi" w:hAnsiTheme="majorBidi" w:cstheme="majorBidi"/>
-          <w:lang w:val="en-GB"/>
-        </w:rPr>
-        <w:t>the same process type and experiential meaning</w:t>
-      </w:r>
-      <w:r>
-        <w:rPr>
-          <w:rFonts w:asciiTheme="majorBidi" w:hAnsiTheme="majorBidi" w:cstheme="majorBidi"/>
-          <w:lang w:val="en-GB"/>
-        </w:rPr>
-        <w:t xml:space="preserve">, </w:t>
-      </w:r>
-      <w:r>
-        <w:rPr>
-          <w:rFonts w:asciiTheme="majorBidi" w:hAnsiTheme="majorBidi" w:cstheme="majorBidi"/>
-          <w:lang w:val="en-GB"/>
-        </w:rPr>
-        <w:t>with Participants that have the same referents in the same roles.</w:t>
+          <w:i/>
+          <w:iCs/>
+          <w:lang w:val="en-GB"/>
+        </w:rPr>
+        <w:t>during the pandemic</w:t>
+      </w:r>
+      <w:r>
+        <w:rPr>
+          <w:rFonts w:asciiTheme="majorBidi" w:hAnsiTheme="majorBidi" w:cstheme="majorBidi"/>
+          <w:lang w:val="en-GB"/>
+        </w:rPr>
+        <w:t xml:space="preserve"> and </w:t>
+      </w:r>
+      <w:r>
+        <w:rPr>
+          <w:rFonts w:asciiTheme="majorBidi" w:hAnsiTheme="majorBidi" w:cstheme="majorBidi"/>
+          <w:i/>
+          <w:iCs/>
+          <w:lang w:val="en-GB"/>
+        </w:rPr>
+        <w:t>in online interactions</w:t>
+      </w:r>
+      <w:r>
+        <w:rPr>
+          <w:rFonts w:asciiTheme="majorBidi" w:hAnsiTheme="majorBidi" w:cstheme="majorBidi"/>
+          <w:lang w:val="en-GB"/>
+        </w:rPr>
+        <w:t xml:space="preserve"> are relations. A circumstance whose complement construes an entity, place or point in time, such as </w:t>
+      </w:r>
+      <w:r>
+        <w:rPr>
+          <w:rFonts w:asciiTheme="majorBidi" w:hAnsiTheme="majorBidi" w:cstheme="majorBidi"/>
+          <w:i/>
+          <w:iCs/>
+          <w:lang w:val="en-GB"/>
+        </w:rPr>
+        <w:t>in the kitchen</w:t>
+      </w:r>
+      <w:r>
+        <w:rPr>
+          <w:rFonts w:asciiTheme="majorBidi" w:hAnsiTheme="majorBidi" w:cstheme="majorBidi"/>
+          <w:lang w:val="en-GB"/>
+        </w:rPr>
+        <w:t xml:space="preserve"> or </w:t>
+      </w:r>
+      <w:r>
+        <w:rPr>
+          <w:rFonts w:asciiTheme="majorBidi" w:hAnsiTheme="majorBidi" w:cstheme="majorBidi"/>
+          <w:i/>
+          <w:iCs/>
+          <w:lang w:val="en-GB"/>
+        </w:rPr>
+        <w:t>yesterday</w:t>
+      </w:r>
+      <w:r>
+        <w:rPr>
+          <w:rFonts w:asciiTheme="majorBidi" w:hAnsiTheme="majorBidi" w:cstheme="majorBidi"/>
+          <w:lang w:val="en-GB"/>
+        </w:rPr>
+        <w:t>, locates or specifies the figure without relating it to another, and is part of the element.</w:t>
       </w:r>
     </w:p>
     <w:p>
@@ -2808,7 +3348,7 @@
           <w:rFonts w:asciiTheme="majorBidi" w:hAnsiTheme="majorBidi" w:cstheme="majorBidi"/>
           <w:lang w:val="en-GB"/>
         </w:rPr>
-        <w:t xml:space="preserve">Identity does not depend on wording, voice, tense or modality. O3, </w:t>
+        <w:t xml:space="preserve">The criterion is the complement, not the circumstance type, because the same relation can be realised by a clause or by a circumstance. </w:t>
       </w:r>
       <w:r>
         <w:rPr>
@@ -2817,14 +3357,14 @@
           <w:iCs/>
           <w:lang w:val="en-GB"/>
         </w:rPr>
-        <w:t>the norms around dating differ</w:t>
-      </w:r>
-      <w:r>
-        <w:rPr>
-          <w:rFonts w:asciiTheme="majorBidi" w:hAnsiTheme="majorBidi" w:cstheme="majorBidi"/>
-          <w:lang w:val="en-GB"/>
-        </w:rPr>
-        <w:t xml:space="preserve">, and the text’s </w:t>
+        <w:t>When you meet them face to face</w:t>
+      </w:r>
+      <w:r>
+        <w:rPr>
+          <w:rFonts w:asciiTheme="majorBidi" w:hAnsiTheme="majorBidi" w:cstheme="majorBidi"/>
+          <w:lang w:val="en-GB"/>
+        </w:rPr>
+        <w:t xml:space="preserve"> and </w:t>
       </w:r>
       <w:r>
         <w:rPr>
@@ -2833,46 +3373,56 @@
           <w:iCs/>
           <w:lang w:val="en-GB"/>
         </w:rPr>
-        <w:t>conventions around dating norms differ</w:t>
-      </w:r>
-      <w:r>
-        <w:rPr>
-          <w:rFonts w:asciiTheme="majorBidi" w:hAnsiTheme="majorBidi" w:cstheme="majorBidi"/>
-          <w:lang w:val="en-GB"/>
-        </w:rPr>
-        <w:t xml:space="preserve"> construe the same figure with the same Carrier. Modality grades the writer’s commitment to a figure without changing it: </w:t>
-      </w:r>
-      <w:r>
-        <w:rPr>
-          <w:rFonts w:asciiTheme="majorBidi" w:hAnsiTheme="majorBidi" w:cstheme="majorBidi"/>
+        <w:t>in face-to-face interactions</w:t>
+      </w:r>
+      <w:r>
+        <w:rPr>
+          <w:rFonts w:asciiTheme="majorBidi" w:hAnsiTheme="majorBidi" w:cstheme="majorBidi"/>
+          <w:lang w:val="en-GB"/>
+        </w:rPr>
+        <w:t xml:space="preserve"> construe the same temporal relation; annotating one and not the other would make coding depend on the writer’s choice of rank. Because circumstances lie outside the experiential nucleus, those that remain part of an element do not affect its identity.</w:t>
+      </w:r>
+    </w:p>
+    <w:p>
+      <w:pPr>
+        <w:spacing w:before="210" w:after="100"/>
+        <w:rPr>
+          <w:rFonts w:asciiTheme="majorBidi" w:hAnsiTheme="majorBidi" w:cstheme="majorBidi"/>
+          <w:lang w:val="en-GB"/>
+        </w:rPr>
+      </w:pPr>
+      <w:r>
+        <w:rPr>
+          <w:rFonts w:asciiTheme="majorBidi" w:hAnsiTheme="majorBidi" w:cstheme="majorBidi"/>
+          <w:b/>
+          <w:bCs/>
           <w:i/>
           <w:iCs/>
           <w:lang w:val="en-GB"/>
         </w:rPr>
-        <w:t>online dating might be a better option</w:t>
-      </w:r>
-      <w:r>
-        <w:rPr>
-          <w:rFonts w:asciiTheme="majorBidi" w:hAnsiTheme="majorBidi" w:cstheme="majorBidi"/>
-          <w:lang w:val="en-GB"/>
-        </w:rPr>
-        <w:t xml:space="preserve"> and </w:t>
-      </w:r>
-      <w:r>
-        <w:rPr>
-          <w:rFonts w:asciiTheme="majorBidi" w:hAnsiTheme="majorBidi" w:cstheme="majorBidi"/>
+        <w:t>4.</w:t>
+      </w:r>
+      <w:r>
+        <w:rPr>
+          <w:rFonts w:asciiTheme="majorBidi" w:hAnsiTheme="majorBidi" w:cstheme="majorBidi"/>
+          <w:b/>
+          <w:bCs/>
           <w:i/>
           <w:iCs/>
           <w:lang w:val="en-GB"/>
         </w:rPr>
-        <w:t>online dating is a better option</w:t>
-      </w:r>
-      <w:r>
-        <w:rPr>
-          <w:rFonts w:asciiTheme="majorBidi" w:hAnsiTheme="majorBidi" w:cstheme="majorBidi"/>
-          <w:lang w:val="en-GB"/>
-        </w:rPr>
-        <w:t xml:space="preserve"> are the same content.</w:t>
+        <w:t>1</w:t>
+      </w:r>
+      <w:r>
+        <w:rPr>
+          <w:rFonts w:asciiTheme="majorBidi" w:hAnsiTheme="majorBidi" w:cstheme="majorBidi"/>
+          <w:b/>
+          <w:bCs/>
+          <w:i/>
+          <w:iCs/>
+          <w:lang w:val="en-GB"/>
+        </w:rPr>
+        <w:t>.5 Terms below the clause</w:t>
       </w:r>
     </w:p>
     <w:p>
@@ -2888,39 +3438,79 @@
           <w:rFonts w:asciiTheme="majorBidi" w:hAnsiTheme="majorBidi" w:cstheme="majorBidi"/>
           <w:lang w:val="en-GB"/>
         </w:rPr>
-        <w:t xml:space="preserve">Identity does depend on </w:t>
-      </w:r>
+        <w:t xml:space="preserve">Logico-semantic relations operate at group and phrase rank as well as between clauses. In </w:t>
+      </w:r>
+      <w:r>
+        <w:rPr>
+          <w:rFonts w:asciiTheme="majorBidi" w:hAnsiTheme="majorBidi" w:cstheme="majorBidi"/>
+          <w:i/>
+          <w:iCs/>
+          <w:lang w:val="en-GB"/>
+        </w:rPr>
+        <w:t>better for the first few dates to be in-person, rather than online</w:t>
+      </w:r>
+      <w:r>
+        <w:rPr>
+          <w:rFonts w:asciiTheme="majorBidi" w:hAnsiTheme="majorBidi" w:cstheme="majorBidi"/>
+          <w:lang w:val="en-GB"/>
+        </w:rPr>
+        <w:t xml:space="preserve">, the two members of the phrase complex are constituents of one figure, not figures. The element register therefore records each figure with its full configuration, so that every Participant and Circumstance of every registered figure is recorded as well. A constituent term is </w:t>
+      </w:r>
+      <w:r>
+        <w:rPr>
+          <w:rFonts w:asciiTheme="majorBidi" w:hAnsiTheme="majorBidi" w:cstheme="majorBidi"/>
+          <w:lang w:val="en-GB"/>
+        </w:rPr>
+        <w:t>available</w:t>
+      </w:r>
+      <w:r>
+        <w:rPr>
+          <w:rFonts w:asciiTheme="majorBidi" w:hAnsiTheme="majorBidi" w:cstheme="majorBidi"/>
+          <w:lang w:val="en-GB"/>
+        </w:rPr>
+        <w:t xml:space="preserve"> if the same referent occurs as a constituent of any figure already in the register.</w:t>
+      </w:r>
+    </w:p>
+    <w:p>
+      <w:pPr>
+        <w:spacing w:before="210" w:after="100"/>
+        <w:rPr>
+          <w:rFonts w:asciiTheme="majorBidi" w:hAnsiTheme="majorBidi" w:cstheme="majorBidi"/>
+          <w:lang w:val="en-GB"/>
+        </w:rPr>
+      </w:pPr>
       <w:r>
         <w:rPr>
           <w:rFonts w:asciiTheme="majorBidi" w:hAnsiTheme="majorBidi" w:cstheme="majorBidi"/>
           <w:b/>
           <w:bCs/>
-          <w:lang w:val="en-GB"/>
-        </w:rPr>
-        <w:t>polarity</w:t>
-      </w:r>
-      <w:r>
-        <w:rPr>
-          <w:rFonts w:asciiTheme="majorBidi" w:hAnsiTheme="majorBidi" w:cstheme="majorBidi"/>
-          <w:lang w:val="en-GB"/>
-        </w:rPr>
-        <w:t xml:space="preserve">. Polarity is not part of TRANSITIVITY but it determines what is asserted: </w:t>
-      </w:r>
-      <w:r>
-        <w:rPr>
-          <w:rFonts w:asciiTheme="majorBidi" w:hAnsiTheme="majorBidi" w:cstheme="majorBidi"/>
           <w:i/>
           <w:iCs/>
           <w:lang w:val="en-GB"/>
         </w:rPr>
-        <w:t>online dating is not the better option</w:t>
-      </w:r>
-      <w:r>
-        <w:rPr>
-          <w:rFonts w:asciiTheme="majorBidi" w:hAnsiTheme="majorBidi" w:cstheme="majorBidi"/>
-          <w:lang w:val="en-GB"/>
-        </w:rPr>
-        <w:t xml:space="preserve"> construes the same configuration as O1 and asserts its opposite. Elements with the same configuration and opposite polarity are different content. Otherwise a reversal of the writer’s plan would be coded as a restatement of it.</w:t>
+        <w:t>4.</w:t>
+      </w:r>
+      <w:r>
+        <w:rPr>
+          <w:rFonts w:asciiTheme="majorBidi" w:hAnsiTheme="majorBidi" w:cstheme="majorBidi"/>
+          <w:b/>
+          <w:bCs/>
+          <w:i/>
+          <w:iCs/>
+          <w:lang w:val="en-GB"/>
+        </w:rPr>
+        <w:t>1</w:t>
+      </w:r>
+      <w:r>
+        <w:rPr>
+          <w:rFonts w:asciiTheme="majorBidi" w:hAnsiTheme="majorBidi" w:cstheme="majorBidi"/>
+          <w:b/>
+          <w:bCs/>
+          <w:i/>
+          <w:iCs/>
+          <w:lang w:val="en-GB"/>
+        </w:rPr>
+        <w:t>.6 Metaphorical realisations</w:t>
       </w:r>
     </w:p>
     <w:p>
@@ -2936,46 +3526,131 @@
           <w:rFonts w:asciiTheme="majorBidi" w:hAnsiTheme="majorBidi" w:cstheme="majorBidi"/>
           <w:lang w:val="en-GB"/>
         </w:rPr>
-        <w:t xml:space="preserve">Some registered elements leave a participant </w:t>
-      </w:r>
+        <w:t xml:space="preserve">Through grammatical metaphor, a figure may be construed as a nominal group rather than a clause, and outlines rely on such nominalisations heavily. For annotation, each is unpacked to its congruent configuration and registered as the figure it construes. </w:t>
+      </w:r>
+      <w:r>
+        <w:rPr>
+          <w:rFonts w:asciiTheme="majorBidi" w:hAnsiTheme="majorBidi" w:cstheme="majorBidi"/>
+          <w:i/>
+          <w:iCs/>
+          <w:lang w:val="en-GB"/>
+        </w:rPr>
+        <w:t>T</w:t>
+      </w:r>
+      <w:r>
+        <w:rPr>
+          <w:rFonts w:asciiTheme="majorBidi" w:hAnsiTheme="majorBidi" w:cstheme="majorBidi"/>
+          <w:i/>
+          <w:iCs/>
+          <w:lang w:val="en-GB"/>
+        </w:rPr>
+        <w:t>he possibility of scammers online</w:t>
+      </w:r>
+      <w:r>
+        <w:rPr>
+          <w:rFonts w:asciiTheme="majorBidi" w:hAnsiTheme="majorBidi" w:cstheme="majorBidi"/>
+          <w:lang w:val="en-GB"/>
+        </w:rPr>
+        <w:t xml:space="preserve"> construes an existential figure, </w:t>
+      </w:r>
+      <w:r>
+        <w:rPr>
+          <w:rFonts w:asciiTheme="majorBidi" w:hAnsiTheme="majorBidi" w:cstheme="majorBidi"/>
+          <w:i/>
+          <w:iCs/>
+          <w:lang w:val="en-GB"/>
+        </w:rPr>
+        <w:t>there may be scammers online</w:t>
+      </w:r>
+      <w:r>
+        <w:rPr>
+          <w:rFonts w:asciiTheme="majorBidi" w:hAnsiTheme="majorBidi" w:cstheme="majorBidi"/>
+          <w:lang w:val="en-GB"/>
+        </w:rPr>
+        <w:t xml:space="preserve">, with </w:t>
+      </w:r>
+      <w:r>
+        <w:rPr>
+          <w:rFonts w:asciiTheme="majorBidi" w:hAnsiTheme="majorBidi" w:cstheme="majorBidi"/>
+          <w:i/>
+          <w:iCs/>
+          <w:lang w:val="en-GB"/>
+        </w:rPr>
+        <w:t>scammers</w:t>
+      </w:r>
+      <w:r>
+        <w:rPr>
+          <w:rFonts w:asciiTheme="majorBidi" w:hAnsiTheme="majorBidi" w:cstheme="majorBidi"/>
+          <w:lang w:val="en-GB"/>
+        </w:rPr>
+        <w:t xml:space="preserve"> as Existent and possibility as its modality. In the text, </w:t>
+      </w:r>
+      <w:r>
+        <w:rPr>
+          <w:rFonts w:asciiTheme="majorBidi" w:hAnsiTheme="majorBidi" w:cstheme="majorBidi"/>
+          <w:i/>
+          <w:iCs/>
+          <w:lang w:val="en-GB"/>
+        </w:rPr>
+        <w:t>self-selection</w:t>
+      </w:r>
+      <w:r>
+        <w:rPr>
+          <w:rFonts w:asciiTheme="majorBidi" w:hAnsiTheme="majorBidi" w:cstheme="majorBidi"/>
+          <w:lang w:val="en-GB"/>
+        </w:rPr>
+        <w:t xml:space="preserve"> nominalises a material figure in which users select themselves out.</w:t>
+      </w:r>
+    </w:p>
+    <w:p>
+      <w:pPr>
+        <w:spacing w:after="150" w:line="276" w:lineRule="auto"/>
+        <w:rPr>
+          <w:rFonts w:asciiTheme="majorBidi" w:hAnsiTheme="majorBidi" w:cstheme="majorBidi"/>
+          <w:lang w:val="en-GB"/>
+        </w:rPr>
+      </w:pPr>
+      <w:r>
+        <w:rPr>
+          <w:rFonts w:asciiTheme="majorBidi" w:hAnsiTheme="majorBidi" w:cstheme="majorBidi"/>
+          <w:lang w:val="en-GB"/>
+        </w:rPr>
+        <w:t>Unpacking goes only as far as the wording supports. Where a nominalisation leaves a participant unexpressed</w:t>
+      </w:r>
+      <w:r>
+        <w:rPr>
+          <w:rFonts w:asciiTheme="majorBidi" w:hAnsiTheme="majorBidi" w:cstheme="majorBidi"/>
+          <w:lang w:val="en-GB"/>
+        </w:rPr>
+        <w:t>,</w:t>
+      </w:r>
+      <w:r>
+        <w:rPr>
+          <w:rFonts w:asciiTheme="majorBidi" w:hAnsiTheme="majorBidi" w:cstheme="majorBidi"/>
+          <w:lang w:val="en-GB"/>
+        </w:rPr>
+        <w:t xml:space="preserve"> the participant is recorded as unspecified rather than supplied, for the same reason that implied relations are not annotated.</w:t>
+      </w:r>
+    </w:p>
+    <w:p>
+      <w:pPr>
+        <w:spacing w:before="280" w:after="130"/>
+        <w:rPr>
+          <w:rFonts w:asciiTheme="majorBidi" w:hAnsiTheme="majorBidi" w:cstheme="majorBidi"/>
+          <w:lang w:val="en-GB"/>
+        </w:rPr>
+      </w:pPr>
       <w:r>
         <w:rPr>
           <w:rFonts w:asciiTheme="majorBidi" w:hAnsiTheme="majorBidi" w:cstheme="majorBidi"/>
           <w:b/>
           <w:bCs/>
-          <w:lang w:val="en-GB"/>
-        </w:rPr>
-        <w:t>unspecified</w:t>
-      </w:r>
-      <w:r>
-        <w:rPr>
-          <w:rFonts w:asciiTheme="majorBidi" w:hAnsiTheme="majorBidi" w:cstheme="majorBidi"/>
-          <w:lang w:val="en-GB"/>
-        </w:rPr>
-        <w:t xml:space="preserve">, </w:t>
-      </w:r>
-      <w:r>
-        <w:rPr>
-          <w:rFonts w:asciiTheme="majorBidi" w:hAnsiTheme="majorBidi" w:cstheme="majorBidi"/>
-          <w:lang w:val="en-GB"/>
-        </w:rPr>
-        <w:t>an outline question (</w:t>
-      </w:r>
-      <w:r>
-        <w:rPr>
-          <w:rFonts w:asciiTheme="majorBidi" w:hAnsiTheme="majorBidi" w:cstheme="majorBidi"/>
-          <w:i/>
-          <w:iCs/>
-          <w:lang w:val="en-GB"/>
-        </w:rPr>
-        <w:t>what do we mean by online dating</w:t>
-      </w:r>
-      <w:r>
-        <w:rPr>
-          <w:rFonts w:asciiTheme="majorBidi" w:hAnsiTheme="majorBidi" w:cstheme="majorBidi"/>
-          <w:lang w:val="en-GB"/>
-        </w:rPr>
-        <w:t>), or a nominalisation whose participants are unexpressed. An unspecified participant is matched by any specification of it: a text element that supplies it realises the registered element. The registered figure already contains that participant role; the text fills the role rather than construing a different figure.</w:t>
+          <w:sz w:val="25"/>
+          <w:szCs w:val="25"/>
+          <w:lang w:val="en-GB"/>
+        </w:rPr>
+        <w:lastRenderedPageBreak/>
+        <w:t>4.3 Relations</w:t>
       </w:r>
     </w:p>
     <w:p>
@@ -2995,29 +3670,7 @@
           <w:iCs/>
           <w:lang w:val="en-GB"/>
         </w:rPr>
-        <w:t>4.</w:t>
-      </w:r>
-      <w:r>
-        <w:rPr>
-          <w:rFonts w:asciiTheme="majorBidi" w:hAnsiTheme="majorBidi" w:cstheme="majorBidi"/>
-          <w:b/>
-          <w:bCs/>
-          <w:i/>
-          <w:iCs/>
-          <w:lang w:val="en-GB"/>
-        </w:rPr>
-        <w:t>1</w:t>
-      </w:r>
-      <w:r>
-        <w:rPr>
-          <w:rFonts w:asciiTheme="majorBidi" w:hAnsiTheme="majorBidi" w:cstheme="majorBidi"/>
-          <w:b/>
-          <w:bCs/>
-          <w:i/>
-          <w:iCs/>
-          <w:lang w:val="en-GB"/>
-        </w:rPr>
-        <w:t>.4 Circumstances</w:t>
+        <w:t>4.3.1 What a relation is</w:t>
       </w:r>
     </w:p>
     <w:p>
@@ -3033,7 +3686,7 @@
           <w:rFonts w:asciiTheme="majorBidi" w:hAnsiTheme="majorBidi" w:cstheme="majorBidi"/>
           <w:lang w:val="en-GB"/>
         </w:rPr>
-        <w:t xml:space="preserve">A circumstance is annotated as a </w:t>
+        <w:t xml:space="preserve">A relation holds between exactly two </w:t>
       </w:r>
       <w:r>
         <w:rPr>
@@ -3042,465 +3695,20 @@
           <w:bCs/>
           <w:lang w:val="en-GB"/>
         </w:rPr>
-        <w:t>relation</w:t>
-      </w:r>
-      <w:r>
-        <w:rPr>
-          <w:rFonts w:asciiTheme="majorBidi" w:hAnsiTheme="majorBidi" w:cstheme="majorBidi"/>
-          <w:lang w:val="en-GB"/>
-        </w:rPr>
-        <w:t xml:space="preserve"> when its complement construes a figure — an event, state or quality, typically realised as a nominalisation or an event noun — so that it relates the figure of its clause to another. </w:t>
-      </w:r>
-      <w:r>
-        <w:rPr>
-          <w:rFonts w:asciiTheme="majorBidi" w:hAnsiTheme="majorBidi" w:cstheme="majorBidi"/>
-          <w:i/>
-          <w:iCs/>
-          <w:lang w:val="en-GB"/>
-        </w:rPr>
-        <w:t>Despite the ease and convenience presented by online methods</w:t>
-      </w:r>
-      <w:r>
-        <w:rPr>
-          <w:rFonts w:asciiTheme="majorBidi" w:hAnsiTheme="majorBidi" w:cstheme="majorBidi"/>
-          <w:lang w:val="en-GB"/>
-        </w:rPr>
-        <w:t xml:space="preserve">, </w:t>
-      </w:r>
-      <w:r>
-        <w:rPr>
-          <w:rFonts w:asciiTheme="majorBidi" w:hAnsiTheme="majorBidi" w:cstheme="majorBidi"/>
-          <w:i/>
-          <w:iCs/>
-          <w:lang w:val="en-GB"/>
-        </w:rPr>
-        <w:t>during the pandemic</w:t>
-      </w:r>
-      <w:r>
-        <w:rPr>
-          <w:rFonts w:asciiTheme="majorBidi" w:hAnsiTheme="majorBidi" w:cstheme="majorBidi"/>
-          <w:lang w:val="en-GB"/>
-        </w:rPr>
-        <w:t xml:space="preserve"> and </w:t>
-      </w:r>
-      <w:r>
-        <w:rPr>
-          <w:rFonts w:asciiTheme="majorBidi" w:hAnsiTheme="majorBidi" w:cstheme="majorBidi"/>
-          <w:i/>
-          <w:iCs/>
-          <w:lang w:val="en-GB"/>
-        </w:rPr>
-        <w:t>in online interactions</w:t>
-      </w:r>
-      <w:r>
-        <w:rPr>
-          <w:rFonts w:asciiTheme="majorBidi" w:hAnsiTheme="majorBidi" w:cstheme="majorBidi"/>
-          <w:lang w:val="en-GB"/>
-        </w:rPr>
-        <w:t xml:space="preserve"> are relations. A circumstance whose complement construes an entity, place or point in time, such as </w:t>
-      </w:r>
-      <w:r>
-        <w:rPr>
-          <w:rFonts w:asciiTheme="majorBidi" w:hAnsiTheme="majorBidi" w:cstheme="majorBidi"/>
-          <w:i/>
-          <w:iCs/>
-          <w:lang w:val="en-GB"/>
-        </w:rPr>
-        <w:t>in the kitchen</w:t>
-      </w:r>
-      <w:r>
-        <w:rPr>
-          <w:rFonts w:asciiTheme="majorBidi" w:hAnsiTheme="majorBidi" w:cstheme="majorBidi"/>
-          <w:lang w:val="en-GB"/>
-        </w:rPr>
-        <w:t xml:space="preserve"> or </w:t>
-      </w:r>
-      <w:r>
-        <w:rPr>
-          <w:rFonts w:asciiTheme="majorBidi" w:hAnsiTheme="majorBidi" w:cstheme="majorBidi"/>
-          <w:i/>
-          <w:iCs/>
-          <w:lang w:val="en-GB"/>
-        </w:rPr>
-        <w:t>yesterday</w:t>
-      </w:r>
-      <w:r>
-        <w:rPr>
-          <w:rFonts w:asciiTheme="majorBidi" w:hAnsiTheme="majorBidi" w:cstheme="majorBidi"/>
-          <w:lang w:val="en-GB"/>
-        </w:rPr>
-        <w:t>, locates or specifies the figure without relating it to another, and is part of the element.</w:t>
-      </w:r>
-    </w:p>
-    <w:p>
-      <w:pPr>
-        <w:spacing w:after="150" w:line="276" w:lineRule="auto"/>
-        <w:rPr>
-          <w:rFonts w:asciiTheme="majorBidi" w:hAnsiTheme="majorBidi" w:cstheme="majorBidi"/>
-          <w:lang w:val="en-GB"/>
-        </w:rPr>
-      </w:pPr>
-      <w:r>
-        <w:rPr>
-          <w:rFonts w:asciiTheme="majorBidi" w:hAnsiTheme="majorBidi" w:cstheme="majorBidi"/>
-          <w:lang w:val="en-GB"/>
-        </w:rPr>
-        <w:t xml:space="preserve">The criterion is the complement, not the circumstance type, because the same relation can be realised by a clause or by a circumstance. </w:t>
-      </w:r>
-      <w:r>
-        <w:rPr>
-          <w:rFonts w:asciiTheme="majorBidi" w:hAnsiTheme="majorBidi" w:cstheme="majorBidi"/>
-          <w:i/>
-          <w:iCs/>
-          <w:lang w:val="en-GB"/>
-        </w:rPr>
-        <w:t>When you meet them face to face</w:t>
-      </w:r>
-      <w:r>
-        <w:rPr>
-          <w:rFonts w:asciiTheme="majorBidi" w:hAnsiTheme="majorBidi" w:cstheme="majorBidi"/>
-          <w:lang w:val="en-GB"/>
-        </w:rPr>
-        <w:t xml:space="preserve"> and </w:t>
-      </w:r>
-      <w:r>
-        <w:rPr>
-          <w:rFonts w:asciiTheme="majorBidi" w:hAnsiTheme="majorBidi" w:cstheme="majorBidi"/>
-          <w:i/>
-          <w:iCs/>
-          <w:lang w:val="en-GB"/>
-        </w:rPr>
-        <w:t>in face-to-face interactions</w:t>
-      </w:r>
-      <w:r>
-        <w:rPr>
-          <w:rFonts w:asciiTheme="majorBidi" w:hAnsiTheme="majorBidi" w:cstheme="majorBidi"/>
-          <w:lang w:val="en-GB"/>
-        </w:rPr>
-        <w:t xml:space="preserve"> construe the same temporal relation; annotating one and not the other would make coding depend on the writer’s choice of rank. Because circumstances lie outside the experiential nucleus, those that remain part of an element do not affect its identity.</w:t>
-      </w:r>
-    </w:p>
-    <w:p>
-      <w:pPr>
-        <w:spacing w:before="210" w:after="100"/>
-        <w:rPr>
-          <w:rFonts w:asciiTheme="majorBidi" w:hAnsiTheme="majorBidi" w:cstheme="majorBidi"/>
-          <w:lang w:val="en-GB"/>
-        </w:rPr>
-      </w:pPr>
+        <w:t>terms</w:t>
+      </w:r>
+      <w:r>
+        <w:rPr>
+          <w:rFonts w:asciiTheme="majorBidi" w:hAnsiTheme="majorBidi" w:cstheme="majorBidi"/>
+          <w:lang w:val="en-GB"/>
+        </w:rPr>
+        <w:t xml:space="preserve"> and construes how one bears on the other. Semantically, every relation annotated here is one of the three types of </w:t>
+      </w:r>
       <w:r>
         <w:rPr>
           <w:rFonts w:asciiTheme="majorBidi" w:hAnsiTheme="majorBidi" w:cstheme="majorBidi"/>
           <w:b/>
           <w:bCs/>
-          <w:i/>
-          <w:iCs/>
-          <w:lang w:val="en-GB"/>
-        </w:rPr>
-        <w:t>4.</w:t>
-      </w:r>
-      <w:r>
-        <w:rPr>
-          <w:rFonts w:asciiTheme="majorBidi" w:hAnsiTheme="majorBidi" w:cstheme="majorBidi"/>
-          <w:b/>
-          <w:bCs/>
-          <w:i/>
-          <w:iCs/>
-          <w:lang w:val="en-GB"/>
-        </w:rPr>
-        <w:t>1</w:t>
-      </w:r>
-      <w:r>
-        <w:rPr>
-          <w:rFonts w:asciiTheme="majorBidi" w:hAnsiTheme="majorBidi" w:cstheme="majorBidi"/>
-          <w:b/>
-          <w:bCs/>
-          <w:i/>
-          <w:iCs/>
-          <w:lang w:val="en-GB"/>
-        </w:rPr>
-        <w:t>.5 Terms below the clause</w:t>
-      </w:r>
-    </w:p>
-    <w:p>
-      <w:pPr>
-        <w:spacing w:after="150" w:line="276" w:lineRule="auto"/>
-        <w:rPr>
-          <w:rFonts w:asciiTheme="majorBidi" w:hAnsiTheme="majorBidi" w:cstheme="majorBidi"/>
-          <w:lang w:val="en-GB"/>
-        </w:rPr>
-      </w:pPr>
-      <w:r>
-        <w:rPr>
-          <w:rFonts w:asciiTheme="majorBidi" w:hAnsiTheme="majorBidi" w:cstheme="majorBidi"/>
-          <w:lang w:val="en-GB"/>
-        </w:rPr>
-        <w:t xml:space="preserve">Logico-semantic relations operate at group and phrase rank as well as between clauses. In </w:t>
-      </w:r>
-      <w:r>
-        <w:rPr>
-          <w:rFonts w:asciiTheme="majorBidi" w:hAnsiTheme="majorBidi" w:cstheme="majorBidi"/>
-          <w:i/>
-          <w:iCs/>
-          <w:lang w:val="en-GB"/>
-        </w:rPr>
-        <w:t>better for the first few dates to be in-person, rather than online</w:t>
-      </w:r>
-      <w:r>
-        <w:rPr>
-          <w:rFonts w:asciiTheme="majorBidi" w:hAnsiTheme="majorBidi" w:cstheme="majorBidi"/>
-          <w:lang w:val="en-GB"/>
-        </w:rPr>
-        <w:t xml:space="preserve">, the two members of the phrase complex are constituents of one figure, not figures. The element register therefore records each figure with its full configuration, so that every Participant and Circumstance of every registered figure is recorded as well. A constituent term is </w:t>
-      </w:r>
-      <w:r>
-        <w:rPr>
-          <w:rFonts w:asciiTheme="majorBidi" w:hAnsiTheme="majorBidi" w:cstheme="majorBidi"/>
-          <w:b/>
-          <w:bCs/>
-          <w:lang w:val="en-GB"/>
-        </w:rPr>
-        <w:t>available</w:t>
-      </w:r>
-      <w:r>
-        <w:rPr>
-          <w:rFonts w:asciiTheme="majorBidi" w:hAnsiTheme="majorBidi" w:cstheme="majorBidi"/>
-          <w:lang w:val="en-GB"/>
-        </w:rPr>
-        <w:t xml:space="preserve"> if the same referent occurs as a constituent of any figure already in the register.</w:t>
-      </w:r>
-    </w:p>
-    <w:p>
-      <w:pPr>
-        <w:spacing w:before="210" w:after="100"/>
-        <w:rPr>
-          <w:rFonts w:asciiTheme="majorBidi" w:hAnsiTheme="majorBidi" w:cstheme="majorBidi"/>
-          <w:lang w:val="en-GB"/>
-        </w:rPr>
-      </w:pPr>
-      <w:r>
-        <w:rPr>
-          <w:rFonts w:asciiTheme="majorBidi" w:hAnsiTheme="majorBidi" w:cstheme="majorBidi"/>
-          <w:b/>
-          <w:bCs/>
-          <w:i/>
-          <w:iCs/>
-          <w:lang w:val="en-GB"/>
-        </w:rPr>
-        <w:t>4.</w:t>
-      </w:r>
-      <w:r>
-        <w:rPr>
-          <w:rFonts w:asciiTheme="majorBidi" w:hAnsiTheme="majorBidi" w:cstheme="majorBidi"/>
-          <w:b/>
-          <w:bCs/>
-          <w:i/>
-          <w:iCs/>
-          <w:lang w:val="en-GB"/>
-        </w:rPr>
-        <w:t>1</w:t>
-      </w:r>
-      <w:r>
-        <w:rPr>
-          <w:rFonts w:asciiTheme="majorBidi" w:hAnsiTheme="majorBidi" w:cstheme="majorBidi"/>
-          <w:b/>
-          <w:bCs/>
-          <w:i/>
-          <w:iCs/>
-          <w:lang w:val="en-GB"/>
-        </w:rPr>
-        <w:t>.6 Metaphorical realisations</w:t>
-      </w:r>
-    </w:p>
-    <w:p>
-      <w:pPr>
-        <w:spacing w:after="150" w:line="276" w:lineRule="auto"/>
-        <w:rPr>
-          <w:rFonts w:asciiTheme="majorBidi" w:hAnsiTheme="majorBidi" w:cstheme="majorBidi"/>
-          <w:lang w:val="en-GB"/>
-        </w:rPr>
-      </w:pPr>
-      <w:r>
-        <w:rPr>
-          <w:rFonts w:asciiTheme="majorBidi" w:hAnsiTheme="majorBidi" w:cstheme="majorBidi"/>
-          <w:lang w:val="en-GB"/>
-        </w:rPr>
-        <w:t xml:space="preserve">Through grammatical metaphor, a figure may be construed as a nominal group rather than a clause, and outlines rely on such nominalisations heavily. For annotation, each is unpacked to its congruent configuration and registered as the figure it construes. O9’s </w:t>
-      </w:r>
-      <w:r>
-        <w:rPr>
-          <w:rFonts w:asciiTheme="majorBidi" w:hAnsiTheme="majorBidi" w:cstheme="majorBidi"/>
-          <w:i/>
-          <w:iCs/>
-          <w:lang w:val="en-GB"/>
-        </w:rPr>
-        <w:t>the possibility of scammers online</w:t>
-      </w:r>
-      <w:r>
-        <w:rPr>
-          <w:rFonts w:asciiTheme="majorBidi" w:hAnsiTheme="majorBidi" w:cstheme="majorBidi"/>
-          <w:lang w:val="en-GB"/>
-        </w:rPr>
-        <w:t xml:space="preserve"> construes an existential figure, </w:t>
-      </w:r>
-      <w:r>
-        <w:rPr>
-          <w:rFonts w:asciiTheme="majorBidi" w:hAnsiTheme="majorBidi" w:cstheme="majorBidi"/>
-          <w:i/>
-          <w:iCs/>
-          <w:lang w:val="en-GB"/>
-        </w:rPr>
-        <w:t>there may be scammers online</w:t>
-      </w:r>
-      <w:r>
-        <w:rPr>
-          <w:rFonts w:asciiTheme="majorBidi" w:hAnsiTheme="majorBidi" w:cstheme="majorBidi"/>
-          <w:lang w:val="en-GB"/>
-        </w:rPr>
-        <w:t xml:space="preserve">, with </w:t>
-      </w:r>
-      <w:r>
-        <w:rPr>
-          <w:rFonts w:asciiTheme="majorBidi" w:hAnsiTheme="majorBidi" w:cstheme="majorBidi"/>
-          <w:i/>
-          <w:iCs/>
-          <w:lang w:val="en-GB"/>
-        </w:rPr>
-        <w:t>scammers</w:t>
-      </w:r>
-      <w:r>
-        <w:rPr>
-          <w:rFonts w:asciiTheme="majorBidi" w:hAnsiTheme="majorBidi" w:cstheme="majorBidi"/>
-          <w:lang w:val="en-GB"/>
-        </w:rPr>
-        <w:t xml:space="preserve"> as Existent and possibility as its modality. In the text, </w:t>
-      </w:r>
-      <w:r>
-        <w:rPr>
-          <w:rFonts w:asciiTheme="majorBidi" w:hAnsiTheme="majorBidi" w:cstheme="majorBidi"/>
-          <w:i/>
-          <w:iCs/>
-          <w:lang w:val="en-GB"/>
-        </w:rPr>
-        <w:t>self-selection</w:t>
-      </w:r>
-      <w:r>
-        <w:rPr>
-          <w:rFonts w:asciiTheme="majorBidi" w:hAnsiTheme="majorBidi" w:cstheme="majorBidi"/>
-          <w:lang w:val="en-GB"/>
-        </w:rPr>
-        <w:t xml:space="preserve"> nominalises a material figure in which users select themselves out.</w:t>
-      </w:r>
-    </w:p>
-    <w:p>
-      <w:pPr>
-        <w:spacing w:after="150" w:line="276" w:lineRule="auto"/>
-        <w:rPr>
-          <w:rFonts w:asciiTheme="majorBidi" w:hAnsiTheme="majorBidi" w:cstheme="majorBidi"/>
-          <w:lang w:val="en-GB"/>
-        </w:rPr>
-      </w:pPr>
-      <w:r>
-        <w:rPr>
-          <w:rFonts w:asciiTheme="majorBidi" w:hAnsiTheme="majorBidi" w:cstheme="majorBidi"/>
-          <w:lang w:val="en-GB"/>
-        </w:rPr>
-        <w:t xml:space="preserve">Unpacking goes only as far as the wording supports. Where a nominalisation leaves a participant unexpressed — </w:t>
-      </w:r>
-      <w:r>
-        <w:rPr>
-          <w:rFonts w:asciiTheme="majorBidi" w:hAnsiTheme="majorBidi" w:cstheme="majorBidi"/>
-          <w:i/>
-          <w:iCs/>
-          <w:lang w:val="en-GB"/>
-        </w:rPr>
-        <w:t>restrictions</w:t>
-      </w:r>
-      <w:r>
-        <w:rPr>
-          <w:rFonts w:asciiTheme="majorBidi" w:hAnsiTheme="majorBidi" w:cstheme="majorBidi"/>
-          <w:lang w:val="en-GB"/>
-        </w:rPr>
-        <w:t xml:space="preserve"> in O4 does not say who restricts whom — the participant is recorded as unspecified rather than supplied, for the same reason that implied relations are not annotated.</w:t>
-      </w:r>
-    </w:p>
-    <w:p>
-      <w:pPr>
-        <w:spacing w:before="280" w:after="130"/>
-        <w:rPr>
-          <w:rFonts w:asciiTheme="majorBidi" w:hAnsiTheme="majorBidi" w:cstheme="majorBidi"/>
-          <w:lang w:val="en-GB"/>
-        </w:rPr>
-      </w:pPr>
-      <w:r>
-        <w:rPr>
-          <w:rFonts w:asciiTheme="majorBidi" w:hAnsiTheme="majorBidi" w:cstheme="majorBidi"/>
-          <w:b/>
-          <w:bCs/>
-          <w:sz w:val="25"/>
-          <w:szCs w:val="25"/>
-          <w:lang w:val="en-GB"/>
-        </w:rPr>
-        <w:t>4.3 Relations</w:t>
-      </w:r>
-    </w:p>
-    <w:p>
-      <w:pPr>
-        <w:spacing w:before="210" w:after="100"/>
-        <w:rPr>
-          <w:rFonts w:asciiTheme="majorBidi" w:hAnsiTheme="majorBidi" w:cstheme="majorBidi"/>
-          <w:lang w:val="en-GB"/>
-        </w:rPr>
-      </w:pPr>
-      <w:r>
-        <w:rPr>
-          <w:rFonts w:asciiTheme="majorBidi" w:hAnsiTheme="majorBidi" w:cstheme="majorBidi"/>
-          <w:b/>
-          <w:bCs/>
-          <w:i/>
-          <w:iCs/>
-          <w:lang w:val="en-GB"/>
-        </w:rPr>
-        <w:lastRenderedPageBreak/>
-        <w:t>4.3.1 What a relation is</w:t>
-      </w:r>
-    </w:p>
-    <w:p>
-      <w:pPr>
-        <w:spacing w:after="150" w:line="276" w:lineRule="auto"/>
-        <w:rPr>
-          <w:rFonts w:asciiTheme="majorBidi" w:hAnsiTheme="majorBidi" w:cstheme="majorBidi"/>
-          <w:lang w:val="en-GB"/>
-        </w:rPr>
-      </w:pPr>
-      <w:r>
-        <w:rPr>
-          <w:rFonts w:asciiTheme="majorBidi" w:hAnsiTheme="majorBidi" w:cstheme="majorBidi"/>
-          <w:lang w:val="en-GB"/>
-        </w:rPr>
-        <w:t xml:space="preserve">A relation holds between exactly two </w:t>
-      </w:r>
-      <w:r>
-        <w:rPr>
-          <w:rFonts w:asciiTheme="majorBidi" w:hAnsiTheme="majorBidi" w:cstheme="majorBidi"/>
-          <w:b/>
-          <w:bCs/>
-          <w:lang w:val="en-GB"/>
-        </w:rPr>
-        <w:t>terms</w:t>
-      </w:r>
-      <w:r>
-        <w:rPr>
-          <w:rFonts w:asciiTheme="majorBidi" w:hAnsiTheme="majorBidi" w:cstheme="majorBidi"/>
-          <w:lang w:val="en-GB"/>
-        </w:rPr>
-        <w:t xml:space="preserve"> and construes how one bears on the other. Semantically, every relation annotated here is one of the three types of </w:t>
-      </w:r>
-      <w:r>
-        <w:rPr>
-          <w:rFonts w:asciiTheme="majorBidi" w:hAnsiTheme="majorBidi" w:cstheme="majorBidi"/>
-          <w:b/>
-          <w:bCs/>
           <w:lang w:val="en-GB"/>
         </w:rPr>
         <w:t>expansion</w:t>
@@ -3510,7 +3718,21 @@
           <w:rFonts w:asciiTheme="majorBidi" w:hAnsiTheme="majorBidi" w:cstheme="majorBidi"/>
           <w:lang w:val="en-GB"/>
         </w:rPr>
-        <w:t xml:space="preserve"> distinguished in SFL: elaboration, extension or enhancement (Halliday &amp; Matthiessen, 2014). A term may be an element, a constituent of one (environment C), or a relation that itself serves as a term — as when a clause realising a relation is linked by a conjunction to another clause. This nesting is a normal property of logical structure and is recorded as such.</w:t>
+        <w:t xml:space="preserve"> distinguished in SFL: elaboration, extension or enhancement (Halliday &amp; Matthiessen, 2014). A term may be an element, a constituent of one (environment C), or a relation that itself serves as a term</w:t>
+      </w:r>
+      <w:r>
+        <w:rPr>
+          <w:rFonts w:asciiTheme="majorBidi" w:hAnsiTheme="majorBidi" w:cstheme="majorBidi"/>
+          <w:lang w:val="en-GB"/>
+        </w:rPr>
+        <w:t>,</w:t>
+      </w:r>
+      <w:r>
+        <w:rPr>
+          <w:rFonts w:asciiTheme="majorBidi" w:hAnsiTheme="majorBidi" w:cstheme="majorBidi"/>
+          <w:lang w:val="en-GB"/>
+        </w:rPr>
+        <w:t xml:space="preserve"> as when a clause realising a relation is linked by a conjunction to another clause. </w:t>
       </w:r>
     </w:p>
     <w:p>
@@ -5759,54 +5981,6 @@
     </w:p>
     <w:p>
       <w:pPr>
-        <w:spacing w:after="150" w:line="276" w:lineRule="auto"/>
-        <w:rPr>
-          <w:rFonts w:asciiTheme="majorBidi" w:hAnsiTheme="majorBidi" w:cstheme="majorBidi"/>
-          <w:lang w:val="en-GB"/>
-        </w:rPr>
-      </w:pPr>
-      <w:r>
-        <w:rPr>
-          <w:rFonts w:asciiTheme="majorBidi" w:hAnsiTheme="majorBidi" w:cstheme="majorBidi"/>
-          <w:lang w:val="en-GB"/>
-        </w:rPr>
-        <w:t>Following Halliday and Matthiessen, addition has positive (</w:t>
-      </w:r>
-      <w:r>
-        <w:rPr>
-          <w:rFonts w:asciiTheme="majorBidi" w:hAnsiTheme="majorBidi" w:cstheme="majorBidi"/>
-          <w:i/>
-          <w:iCs/>
-          <w:lang w:val="en-GB"/>
-        </w:rPr>
-        <w:t>and</w:t>
-      </w:r>
-      <w:r>
-        <w:rPr>
-          <w:rFonts w:asciiTheme="majorBidi" w:hAnsiTheme="majorBidi" w:cstheme="majorBidi"/>
-          <w:lang w:val="en-GB"/>
-        </w:rPr>
-        <w:t>) and negative (</w:t>
-      </w:r>
-      <w:r>
-        <w:rPr>
-          <w:rFonts w:asciiTheme="majorBidi" w:hAnsiTheme="majorBidi" w:cstheme="majorBidi"/>
-          <w:i/>
-          <w:iCs/>
-          <w:lang w:val="en-GB"/>
-        </w:rPr>
-        <w:t>nor</w:t>
-      </w:r>
-      <w:r>
-        <w:rPr>
-          <w:rFonts w:asciiTheme="majorBidi" w:hAnsiTheme="majorBidi" w:cstheme="majorBidi"/>
-          <w:lang w:val="en-GB"/>
-        </w:rPr>
-        <w:t>) forms, and adversative is itself a kind of addition; they are listed separately here because §6.6 treats them differently. Direction matters because §6.8 treats a relation with reversed direction as a new relation.</w:t>
-      </w:r>
-    </w:p>
-    <w:p>
-      <w:pPr>
         <w:spacing w:before="210" w:after="100"/>
         <w:rPr>
           <w:rFonts w:asciiTheme="majorBidi" w:hAnsiTheme="majorBidi" w:cstheme="majorBidi"/>
@@ -5838,7 +6012,21 @@
           <w:rFonts w:asciiTheme="majorBidi" w:hAnsiTheme="majorBidi" w:cstheme="majorBidi"/>
           <w:lang w:val="en-GB"/>
         </w:rPr>
-        <w:t>Expansion is a semantic motif that recurs throughout the grammar, not only between clauses (Halliday &amp; Matthiessen, 2014). The same relation may be realised in several environments, and annotators must look for it in all of them. Examples are from the pilot participant unless marked as constructed.</w:t>
+        <w:t>Expansion is a semantic motif that recurs throughout the grammar, not only between clauses. The same relation may be realised in several environments, and annotators must look for it in all of them. Examples are</w:t>
+      </w:r>
+      <w:r>
+        <w:rPr>
+          <w:rFonts w:asciiTheme="majorBidi" w:hAnsiTheme="majorBidi" w:cstheme="majorBidi"/>
+          <w:lang w:val="en-GB"/>
+        </w:rPr>
+        <w:t xml:space="preserve"> written by me</w:t>
+      </w:r>
+      <w:r>
+        <w:rPr>
+          <w:rFonts w:asciiTheme="majorBidi" w:hAnsiTheme="majorBidi" w:cstheme="majorBidi"/>
+          <w:lang w:val="en-GB"/>
+        </w:rPr>
+        <w:t>.</w:t>
       </w:r>
     </w:p>
     <w:tbl>
@@ -6142,15 +6330,6 @@
               </w:rPr>
               <w:t>you meet them face to face</w:t>
             </w:r>
-            <w:r>
-              <w:rPr>
-                <w:rFonts w:asciiTheme="majorBidi" w:hAnsiTheme="majorBidi" w:cstheme="majorBidi"/>
-                <w:sz w:val="17"/>
-                <w:szCs w:val="17"/>
-                <w:lang w:val="en-GB"/>
-              </w:rPr>
-              <w:t xml:space="preserve"> (O11)</w:t>
-            </w:r>
           </w:p>
         </w:tc>
       </w:tr>
@@ -6491,7 +6670,6 @@
                 <w:szCs w:val="17"/>
                 <w:lang w:val="en-GB"/>
               </w:rPr>
-              <w:lastRenderedPageBreak/>
               <w:t>D</w:t>
             </w:r>
           </w:p>
@@ -6637,6 +6815,7 @@
                 <w:szCs w:val="17"/>
                 <w:lang w:val="en-GB"/>
               </w:rPr>
+              <w:lastRenderedPageBreak/>
               <w:t>E</w:t>
             </w:r>
           </w:p>
@@ -6824,15 +7003,6 @@
               </w:rPr>
               <w:t>a loss of spontaneity</w:t>
             </w:r>
-            <w:r>
-              <w:rPr>
-                <w:rFonts w:asciiTheme="majorBidi" w:hAnsiTheme="majorBidi" w:cstheme="majorBidi"/>
-                <w:sz w:val="17"/>
-                <w:szCs w:val="17"/>
-                <w:lang w:val="en-GB"/>
-              </w:rPr>
-              <w:t xml:space="preserve"> (constructed)</w:t>
-            </w:r>
           </w:p>
           <w:p>
             <w:pPr>
@@ -7059,15 +7229,6 @@
               </w:rPr>
               <w:t>this</w:t>
             </w:r>
-            <w:r>
-              <w:rPr>
-                <w:rFonts w:asciiTheme="majorBidi" w:hAnsiTheme="majorBidi" w:cstheme="majorBidi"/>
-                <w:sz w:val="17"/>
-                <w:szCs w:val="17"/>
-                <w:lang w:val="en-GB"/>
-              </w:rPr>
-              <w:t xml:space="preserve"> (O8)</w:t>
-            </w:r>
           </w:p>
           <w:p>
             <w:pPr>
@@ -7269,15 +7430,6 @@
                 <w:lang w:val="en-GB"/>
               </w:rPr>
               <w:t>the reason for</w:t>
-            </w:r>
-            <w:r>
-              <w:rPr>
-                <w:rFonts w:asciiTheme="majorBidi" w:hAnsiTheme="majorBidi" w:cstheme="majorBidi"/>
-                <w:sz w:val="17"/>
-                <w:szCs w:val="17"/>
-                <w:lang w:val="en-GB"/>
-              </w:rPr>
-              <w:t xml:space="preserve"> (constructed)</w:t>
             </w:r>
           </w:p>
         </w:tc>
@@ -7471,7 +7623,63 @@
           <w:rFonts w:asciiTheme="majorBidi" w:hAnsiTheme="majorBidi" w:cstheme="majorBidi"/>
           <w:lang w:val="en-GB"/>
         </w:rPr>
-        <w:t>Environments A to C belong to the logical metafunction: they are structures whose function is to relate. Environments D to H belong to the experiential metafunction and realise relations through grammatical metaphor, construing a logical relation as a circumstance, a process or a thing. The three kinds of relational process correspond to the three types of expansion — intensive to elaboration, possessive to extension, circumstantial to enhancement — which is why relational clauses are among the most common realisations of relations in argumentative writing.</w:t>
+        <w:t>Environments A to C belong to the logical metafunction</w:t>
+      </w:r>
+      <w:r>
+        <w:rPr>
+          <w:rFonts w:asciiTheme="majorBidi" w:hAnsiTheme="majorBidi" w:cstheme="majorBidi"/>
+          <w:lang w:val="en-GB"/>
+        </w:rPr>
+        <w:t>.</w:t>
+      </w:r>
+      <w:r>
+        <w:rPr>
+          <w:rFonts w:asciiTheme="majorBidi" w:hAnsiTheme="majorBidi" w:cstheme="majorBidi"/>
+          <w:lang w:val="en-GB"/>
+        </w:rPr>
+        <w:t xml:space="preserve"> </w:t>
+      </w:r>
+      <w:r>
+        <w:rPr>
+          <w:rFonts w:asciiTheme="majorBidi" w:hAnsiTheme="majorBidi" w:cstheme="majorBidi"/>
+          <w:lang w:val="en-GB"/>
+        </w:rPr>
+        <w:t>T</w:t>
+      </w:r>
+      <w:r>
+        <w:rPr>
+          <w:rFonts w:asciiTheme="majorBidi" w:hAnsiTheme="majorBidi" w:cstheme="majorBidi"/>
+          <w:lang w:val="en-GB"/>
+        </w:rPr>
+        <w:t>hey are structures whose function is to relate. Environments D to H belong to the experiential metafunction and realise relations through grammatical metaphor, construing a logical relation as a circumstance, a process or a thing. The three kinds of relational process correspond to the three types of expansion</w:t>
+      </w:r>
+      <w:r>
+        <w:rPr>
+          <w:rFonts w:asciiTheme="majorBidi" w:hAnsiTheme="majorBidi" w:cstheme="majorBidi"/>
+          <w:lang w:val="en-GB"/>
+        </w:rPr>
+        <w:t>,</w:t>
+      </w:r>
+      <w:r>
+        <w:rPr>
+          <w:rFonts w:asciiTheme="majorBidi" w:hAnsiTheme="majorBidi" w:cstheme="majorBidi"/>
+          <w:lang w:val="en-GB"/>
+        </w:rPr>
+        <w:t xml:space="preserve"> intensive to elaboration, possessive to extension, circumstantial to enhancement</w:t>
+      </w:r>
+      <w:r>
+        <w:rPr>
+          <w:rFonts w:asciiTheme="majorBidi" w:hAnsiTheme="majorBidi" w:cstheme="majorBidi"/>
+          <w:lang w:val="en-GB"/>
+        </w:rPr>
+        <w:t>,</w:t>
+      </w:r>
+      <w:r>
+        <w:rPr>
+          <w:rFonts w:asciiTheme="majorBidi" w:hAnsiTheme="majorBidi" w:cstheme="majorBidi"/>
+          <w:lang w:val="en-GB"/>
+        </w:rPr>
+        <w:t xml:space="preserve"> which is why relational clauses are among the most common realisations of relations in argumentative writing.</w:t>
       </w:r>
     </w:p>
     <w:p>
@@ -7507,7 +7715,35 @@
           <w:rFonts w:asciiTheme="majorBidi" w:hAnsiTheme="majorBidi" w:cstheme="majorBidi"/>
           <w:lang w:val="en-GB"/>
         </w:rPr>
-        <w:t>In environments A to C no condition is needed: complexing and conjunction exist to relate, so wherever they occur a relation is present.</w:t>
+        <w:t>In environments A to C</w:t>
+      </w:r>
+      <w:r>
+        <w:rPr>
+          <w:rFonts w:asciiTheme="majorBidi" w:hAnsiTheme="majorBidi" w:cstheme="majorBidi"/>
+          <w:lang w:val="en-GB"/>
+        </w:rPr>
+        <w:t>,</w:t>
+      </w:r>
+      <w:r>
+        <w:rPr>
+          <w:rFonts w:asciiTheme="majorBidi" w:hAnsiTheme="majorBidi" w:cstheme="majorBidi"/>
+          <w:lang w:val="en-GB"/>
+        </w:rPr>
+        <w:t xml:space="preserve"> no condition is needed</w:t>
+      </w:r>
+      <w:r>
+        <w:rPr>
+          <w:rFonts w:asciiTheme="majorBidi" w:hAnsiTheme="majorBidi" w:cstheme="majorBidi"/>
+          <w:lang w:val="en-GB"/>
+        </w:rPr>
+        <w:t>, as</w:t>
+      </w:r>
+      <w:r>
+        <w:rPr>
+          <w:rFonts w:asciiTheme="majorBidi" w:hAnsiTheme="majorBidi" w:cstheme="majorBidi"/>
+          <w:lang w:val="en-GB"/>
+        </w:rPr>
+        <w:t xml:space="preserve"> complexing and conjunction exist to relate, so wherever they occur a relation is present.</w:t>
       </w:r>
     </w:p>
     <w:p>
@@ -7523,7 +7759,7 @@
           <w:rFonts w:asciiTheme="majorBidi" w:hAnsiTheme="majorBidi" w:cstheme="majorBidi"/>
           <w:lang w:val="en-GB"/>
         </w:rPr>
-        <w:t xml:space="preserve">Environments D to H are different, because the experiential grammar also does ordinary work that is not relational in the sense required here. A material clause such as </w:t>
+        <w:t xml:space="preserve">Environments D to H are different. A material clause such as </w:t>
       </w:r>
       <w:r>
         <w:rPr>
@@ -7555,16 +7791,12 @@
           <w:rFonts w:asciiTheme="majorBidi" w:hAnsiTheme="majorBidi" w:cstheme="majorBidi"/>
           <w:lang w:val="en-GB"/>
         </w:rPr>
-        <w:t xml:space="preserve"> (O1) ascribes a quality to a Carrier; it construes one state of affairs. Treating every configuration of two participants as a relation would find a relation in nearly every clause.</w:t>
+        <w:t xml:space="preserve"> ascribes a quality to a Carrier; it construes one state of affairs. Treating every configuration of two participants as a relation would find a relation in nearly every clause.</w:t>
       </w:r>
     </w:p>
     <w:p>
       <w:pPr>
-        <w:pBdr>
-          <w:left w:val="single" w:sz="14" w:space="0" w:color="7A7A7A"/>
-        </w:pBdr>
-        <w:spacing w:before="120" w:after="180" w:line="276" w:lineRule="auto"/>
-        <w:ind w:left="300" w:right="300"/>
+        <w:spacing w:after="150" w:line="276" w:lineRule="auto"/>
         <w:rPr>
           <w:rFonts w:asciiTheme="majorBidi" w:hAnsiTheme="majorBidi" w:cstheme="majorBidi"/>
           <w:lang w:val="en-GB"/>
@@ -7593,451 +7825,6 @@
         </w:rPr>
         <w:t>: a figure, realised congruently or through nominalisation, or a reference to one.</w:t>
       </w:r>
-    </w:p>
-    <w:tbl>
-      <w:tblPr>
-        <w:tblW w:w="9360" w:type="dxa"/>
-        <w:tblBorders>
-          <w:top w:val="single" w:sz="4" w:space="0" w:color="auto"/>
-          <w:left w:val="single" w:sz="4" w:space="0" w:color="auto"/>
-          <w:bottom w:val="single" w:sz="4" w:space="0" w:color="auto"/>
-          <w:right w:val="single" w:sz="4" w:space="0" w:color="auto"/>
-          <w:insideH w:val="single" w:sz="4" w:space="0" w:color="auto"/>
-          <w:insideV w:val="single" w:sz="4" w:space="0" w:color="auto"/>
-        </w:tblBorders>
-        <w:tblCellMar>
-          <w:left w:w="10" w:type="dxa"/>
-          <w:right w:w="10" w:type="dxa"/>
-        </w:tblCellMar>
-        <w:tblLook w:val="04A0" w:firstRow="1" w:lastRow="0" w:firstColumn="1" w:lastColumn="0" w:noHBand="0" w:noVBand="1"/>
-      </w:tblPr>
-      <w:tblGrid>
-        <w:gridCol w:w="4680"/>
-        <w:gridCol w:w="4680"/>
-      </w:tblGrid>
-      <w:tr>
-        <w:tc>
-          <w:tcPr>
-            <w:tcW w:w="4680" w:type="dxa"/>
-            <w:shd w:val="clear" w:color="auto" w:fill="E4E4E4"/>
-            <w:tcMar>
-              <w:top w:w="70" w:type="dxa"/>
-              <w:left w:w="100" w:type="dxa"/>
-              <w:bottom w:w="70" w:type="dxa"/>
-              <w:right w:w="100" w:type="dxa"/>
-            </w:tcMar>
-          </w:tcPr>
-          <w:p>
-            <w:pPr>
-              <w:spacing w:line="228" w:lineRule="auto"/>
-              <w:rPr>
-                <w:rFonts w:asciiTheme="majorBidi" w:hAnsiTheme="majorBidi" w:cstheme="majorBidi"/>
-                <w:lang w:val="en-GB"/>
-              </w:rPr>
-            </w:pPr>
-            <w:r>
-              <w:rPr>
-                <w:rFonts w:asciiTheme="majorBidi" w:hAnsiTheme="majorBidi" w:cstheme="majorBidi"/>
-                <w:b/>
-                <w:bCs/>
-                <w:sz w:val="18"/>
-                <w:szCs w:val="18"/>
-                <w:lang w:val="en-GB"/>
-              </w:rPr>
-              <w:t>Annotated as a relation</w:t>
-            </w:r>
-          </w:p>
-        </w:tc>
-        <w:tc>
-          <w:tcPr>
-            <w:tcW w:w="4680" w:type="dxa"/>
-            <w:shd w:val="clear" w:color="auto" w:fill="E4E4E4"/>
-            <w:tcMar>
-              <w:top w:w="70" w:type="dxa"/>
-              <w:left w:w="100" w:type="dxa"/>
-              <w:bottom w:w="70" w:type="dxa"/>
-              <w:right w:w="100" w:type="dxa"/>
-            </w:tcMar>
-          </w:tcPr>
-          <w:p>
-            <w:pPr>
-              <w:spacing w:line="228" w:lineRule="auto"/>
-              <w:rPr>
-                <w:rFonts w:asciiTheme="majorBidi" w:hAnsiTheme="majorBidi" w:cstheme="majorBidi"/>
-                <w:lang w:val="en-GB"/>
-              </w:rPr>
-            </w:pPr>
-            <w:r>
-              <w:rPr>
-                <w:rFonts w:asciiTheme="majorBidi" w:hAnsiTheme="majorBidi" w:cstheme="majorBidi"/>
-                <w:b/>
-                <w:bCs/>
-                <w:sz w:val="18"/>
-                <w:szCs w:val="18"/>
-                <w:lang w:val="en-GB"/>
-              </w:rPr>
-              <w:t>Not annotated as a relation</w:t>
-            </w:r>
-          </w:p>
-        </w:tc>
-      </w:tr>
-      <w:tr>
-        <w:tc>
-          <w:tcPr>
-            <w:tcW w:w="4680" w:type="dxa"/>
-            <w:tcMar>
-              <w:top w:w="70" w:type="dxa"/>
-              <w:left w:w="100" w:type="dxa"/>
-              <w:bottom w:w="70" w:type="dxa"/>
-              <w:right w:w="100" w:type="dxa"/>
-            </w:tcMar>
-          </w:tcPr>
-          <w:p>
-            <w:pPr>
-              <w:spacing w:line="228" w:lineRule="auto"/>
-              <w:rPr>
-                <w:rFonts w:asciiTheme="majorBidi" w:hAnsiTheme="majorBidi" w:cstheme="majorBidi"/>
-                <w:lang w:val="en-GB"/>
-              </w:rPr>
-            </w:pPr>
-            <w:r>
-              <w:rPr>
-                <w:rFonts w:asciiTheme="majorBidi" w:hAnsiTheme="majorBidi" w:cstheme="majorBidi"/>
-                <w:i/>
-                <w:iCs/>
-                <w:sz w:val="18"/>
-                <w:szCs w:val="18"/>
-                <w:lang w:val="en-GB"/>
-              </w:rPr>
-              <w:t>online meeting could help with</w:t>
-            </w:r>
-            <w:r>
-              <w:rPr>
-                <w:rFonts w:asciiTheme="majorBidi" w:hAnsiTheme="majorBidi" w:cstheme="majorBidi"/>
-                <w:sz w:val="18"/>
-                <w:szCs w:val="18"/>
-                <w:lang w:val="en-GB"/>
-              </w:rPr>
-              <w:t xml:space="preserve"> </w:t>
-            </w:r>
-            <w:r>
-              <w:rPr>
-                <w:rFonts w:asciiTheme="majorBidi" w:hAnsiTheme="majorBidi" w:cstheme="majorBidi"/>
-                <w:b/>
-                <w:bCs/>
-                <w:sz w:val="18"/>
-                <w:szCs w:val="18"/>
-                <w:lang w:val="en-GB"/>
-              </w:rPr>
-              <w:t>this</w:t>
-            </w:r>
-            <w:r>
-              <w:rPr>
-                <w:rFonts w:asciiTheme="majorBidi" w:hAnsiTheme="majorBidi" w:cstheme="majorBidi"/>
-                <w:sz w:val="18"/>
-                <w:szCs w:val="18"/>
-                <w:lang w:val="en-GB"/>
-              </w:rPr>
-              <w:t xml:space="preserve"> (O8): </w:t>
-            </w:r>
-            <w:r>
-              <w:rPr>
-                <w:rFonts w:asciiTheme="majorBidi" w:hAnsiTheme="majorBidi" w:cstheme="majorBidi"/>
-                <w:i/>
-                <w:iCs/>
-                <w:sz w:val="18"/>
-                <w:szCs w:val="18"/>
-                <w:lang w:val="en-GB"/>
-              </w:rPr>
-              <w:t>this</w:t>
-            </w:r>
-            <w:r>
-              <w:rPr>
-                <w:rFonts w:asciiTheme="majorBidi" w:hAnsiTheme="majorBidi" w:cstheme="majorBidi"/>
-                <w:sz w:val="18"/>
-                <w:szCs w:val="18"/>
-                <w:lang w:val="en-GB"/>
-              </w:rPr>
-              <w:t xml:space="preserve"> refers to the figure of social awkwardness in O7</w:t>
-            </w:r>
-          </w:p>
-        </w:tc>
-        <w:tc>
-          <w:tcPr>
-            <w:tcW w:w="4680" w:type="dxa"/>
-            <w:tcMar>
-              <w:top w:w="70" w:type="dxa"/>
-              <w:left w:w="100" w:type="dxa"/>
-              <w:bottom w:w="70" w:type="dxa"/>
-              <w:right w:w="100" w:type="dxa"/>
-            </w:tcMar>
-          </w:tcPr>
-          <w:p>
-            <w:pPr>
-              <w:spacing w:line="228" w:lineRule="auto"/>
-              <w:rPr>
-                <w:rFonts w:asciiTheme="majorBidi" w:hAnsiTheme="majorBidi" w:cstheme="majorBidi"/>
-                <w:lang w:val="en-GB"/>
-              </w:rPr>
-            </w:pPr>
-            <w:r>
-              <w:rPr>
-                <w:rFonts w:asciiTheme="majorBidi" w:hAnsiTheme="majorBidi" w:cstheme="majorBidi"/>
-                <w:i/>
-                <w:iCs/>
-                <w:sz w:val="18"/>
-                <w:szCs w:val="18"/>
-                <w:lang w:val="en-GB"/>
-              </w:rPr>
-              <w:t>people meet partners online</w:t>
-            </w:r>
-            <w:r>
-              <w:rPr>
-                <w:rFonts w:asciiTheme="majorBidi" w:hAnsiTheme="majorBidi" w:cstheme="majorBidi"/>
-                <w:sz w:val="18"/>
-                <w:szCs w:val="18"/>
-                <w:lang w:val="en-GB"/>
-              </w:rPr>
-              <w:t>: Actor and Goal are entities, not figures</w:t>
-            </w:r>
-          </w:p>
-        </w:tc>
-      </w:tr>
-      <w:tr>
-        <w:tc>
-          <w:tcPr>
-            <w:tcW w:w="4680" w:type="dxa"/>
-            <w:shd w:val="clear" w:color="auto" w:fill="F8F8F8"/>
-            <w:tcMar>
-              <w:top w:w="70" w:type="dxa"/>
-              <w:left w:w="100" w:type="dxa"/>
-              <w:bottom w:w="70" w:type="dxa"/>
-              <w:right w:w="100" w:type="dxa"/>
-            </w:tcMar>
-          </w:tcPr>
-          <w:p>
-            <w:pPr>
-              <w:spacing w:line="228" w:lineRule="auto"/>
-              <w:rPr>
-                <w:rFonts w:asciiTheme="majorBidi" w:hAnsiTheme="majorBidi" w:cstheme="majorBidi"/>
-                <w:lang w:val="en-GB"/>
-              </w:rPr>
-            </w:pPr>
-            <w:r>
-              <w:rPr>
-                <w:rFonts w:asciiTheme="majorBidi" w:hAnsiTheme="majorBidi" w:cstheme="majorBidi"/>
-                <w:i/>
-                <w:iCs/>
-                <w:sz w:val="18"/>
-                <w:szCs w:val="18"/>
-                <w:lang w:val="en-GB"/>
-              </w:rPr>
-              <w:t>the underlying issue … is</w:t>
-            </w:r>
-            <w:r>
-              <w:rPr>
-                <w:rFonts w:asciiTheme="majorBidi" w:hAnsiTheme="majorBidi" w:cstheme="majorBidi"/>
-                <w:sz w:val="18"/>
-                <w:szCs w:val="18"/>
-                <w:lang w:val="en-GB"/>
-              </w:rPr>
-              <w:t xml:space="preserve"> </w:t>
-            </w:r>
-            <w:r>
-              <w:rPr>
-                <w:rFonts w:asciiTheme="majorBidi" w:hAnsiTheme="majorBidi" w:cstheme="majorBidi"/>
-                <w:b/>
-                <w:bCs/>
-                <w:sz w:val="18"/>
-                <w:szCs w:val="18"/>
-                <w:lang w:val="en-GB"/>
-              </w:rPr>
-              <w:t>the nature of self-selection</w:t>
-            </w:r>
-            <w:r>
-              <w:rPr>
-                <w:rFonts w:asciiTheme="majorBidi" w:hAnsiTheme="majorBidi" w:cstheme="majorBidi"/>
-                <w:sz w:val="18"/>
-                <w:szCs w:val="18"/>
-                <w:lang w:val="en-GB"/>
-              </w:rPr>
-              <w:t>: Token and Value both construe figures</w:t>
-            </w:r>
-          </w:p>
-        </w:tc>
-        <w:tc>
-          <w:tcPr>
-            <w:tcW w:w="4680" w:type="dxa"/>
-            <w:shd w:val="clear" w:color="auto" w:fill="F8F8F8"/>
-            <w:tcMar>
-              <w:top w:w="70" w:type="dxa"/>
-              <w:left w:w="100" w:type="dxa"/>
-              <w:bottom w:w="70" w:type="dxa"/>
-              <w:right w:w="100" w:type="dxa"/>
-            </w:tcMar>
-          </w:tcPr>
-          <w:p>
-            <w:pPr>
-              <w:spacing w:line="228" w:lineRule="auto"/>
-              <w:rPr>
-                <w:rFonts w:asciiTheme="majorBidi" w:hAnsiTheme="majorBidi" w:cstheme="majorBidi"/>
-                <w:lang w:val="en-GB"/>
-              </w:rPr>
-            </w:pPr>
-            <w:r>
-              <w:rPr>
-                <w:rFonts w:asciiTheme="majorBidi" w:hAnsiTheme="majorBidi" w:cstheme="majorBidi"/>
-                <w:i/>
-                <w:iCs/>
-                <w:sz w:val="18"/>
-                <w:szCs w:val="18"/>
-                <w:lang w:val="en-GB"/>
-              </w:rPr>
-              <w:t>online dating might be a better option</w:t>
-            </w:r>
-            <w:r>
-              <w:rPr>
-                <w:rFonts w:asciiTheme="majorBidi" w:hAnsiTheme="majorBidi" w:cstheme="majorBidi"/>
-                <w:sz w:val="18"/>
-                <w:szCs w:val="18"/>
-                <w:lang w:val="en-GB"/>
-              </w:rPr>
-              <w:t>: the Attribute is a quality, and no comparand is expressed (§4.4)</w:t>
-            </w:r>
-          </w:p>
-        </w:tc>
-      </w:tr>
-      <w:tr>
-        <w:tc>
-          <w:tcPr>
-            <w:tcW w:w="4680" w:type="dxa"/>
-            <w:tcMar>
-              <w:top w:w="70" w:type="dxa"/>
-              <w:left w:w="100" w:type="dxa"/>
-              <w:bottom w:w="70" w:type="dxa"/>
-              <w:right w:w="100" w:type="dxa"/>
-            </w:tcMar>
-          </w:tcPr>
-          <w:p>
-            <w:pPr>
-              <w:spacing w:line="228" w:lineRule="auto"/>
-              <w:rPr>
-                <w:rFonts w:asciiTheme="majorBidi" w:hAnsiTheme="majorBidi" w:cstheme="majorBidi"/>
-                <w:lang w:val="en-GB"/>
-              </w:rPr>
-            </w:pPr>
-            <w:r>
-              <w:rPr>
-                <w:rFonts w:asciiTheme="majorBidi" w:hAnsiTheme="majorBidi" w:cstheme="majorBidi"/>
-                <w:b/>
-                <w:bCs/>
-                <w:sz w:val="18"/>
-                <w:szCs w:val="18"/>
-                <w:lang w:val="en-GB"/>
-              </w:rPr>
-              <w:t>despite</w:t>
-            </w:r>
-            <w:r>
-              <w:rPr>
-                <w:rFonts w:asciiTheme="majorBidi" w:hAnsiTheme="majorBidi" w:cstheme="majorBidi"/>
-                <w:sz w:val="18"/>
-                <w:szCs w:val="18"/>
-                <w:lang w:val="en-GB"/>
-              </w:rPr>
-              <w:t xml:space="preserve"> </w:t>
-            </w:r>
-            <w:r>
-              <w:rPr>
-                <w:rFonts w:asciiTheme="majorBidi" w:hAnsiTheme="majorBidi" w:cstheme="majorBidi"/>
-                <w:i/>
-                <w:iCs/>
-                <w:sz w:val="18"/>
-                <w:szCs w:val="18"/>
-                <w:lang w:val="en-GB"/>
-              </w:rPr>
-              <w:t>the ease and convenience presented by online methods</w:t>
-            </w:r>
-            <w:r>
-              <w:rPr>
-                <w:rFonts w:asciiTheme="majorBidi" w:hAnsiTheme="majorBidi" w:cstheme="majorBidi"/>
-                <w:sz w:val="18"/>
-                <w:szCs w:val="18"/>
-                <w:lang w:val="en-GB"/>
-              </w:rPr>
-              <w:t xml:space="preserve">: </w:t>
-            </w:r>
-            <w:r>
-              <w:rPr>
-                <w:rFonts w:asciiTheme="majorBidi" w:hAnsiTheme="majorBidi" w:cstheme="majorBidi"/>
-                <w:i/>
-                <w:iCs/>
-                <w:sz w:val="18"/>
-                <w:szCs w:val="18"/>
-                <w:lang w:val="en-GB"/>
-              </w:rPr>
-              <w:t>ease and convenience</w:t>
-            </w:r>
-            <w:r>
-              <w:rPr>
-                <w:rFonts w:asciiTheme="majorBidi" w:hAnsiTheme="majorBidi" w:cstheme="majorBidi"/>
-                <w:sz w:val="18"/>
-                <w:szCs w:val="18"/>
-                <w:lang w:val="en-GB"/>
-              </w:rPr>
-              <w:t xml:space="preserve"> nominalises a state of affairs</w:t>
-            </w:r>
-          </w:p>
-        </w:tc>
-        <w:tc>
-          <w:tcPr>
-            <w:tcW w:w="4680" w:type="dxa"/>
-            <w:tcMar>
-              <w:top w:w="70" w:type="dxa"/>
-              <w:left w:w="100" w:type="dxa"/>
-              <w:bottom w:w="70" w:type="dxa"/>
-              <w:right w:w="100" w:type="dxa"/>
-            </w:tcMar>
-          </w:tcPr>
-          <w:p>
-            <w:pPr>
-              <w:spacing w:line="228" w:lineRule="auto"/>
-              <w:rPr>
-                <w:rFonts w:asciiTheme="majorBidi" w:hAnsiTheme="majorBidi" w:cstheme="majorBidi"/>
-                <w:lang w:val="en-GB"/>
-              </w:rPr>
-            </w:pPr>
-            <w:r>
-              <w:rPr>
-                <w:rFonts w:asciiTheme="majorBidi" w:hAnsiTheme="majorBidi" w:cstheme="majorBidi"/>
-                <w:i/>
-                <w:iCs/>
-                <w:sz w:val="18"/>
-                <w:szCs w:val="18"/>
-                <w:lang w:val="en-GB"/>
-              </w:rPr>
-              <w:t>in the kitchen</w:t>
-            </w:r>
-            <w:r>
-              <w:rPr>
-                <w:rFonts w:asciiTheme="majorBidi" w:hAnsiTheme="majorBidi" w:cstheme="majorBidi"/>
-                <w:sz w:val="18"/>
-                <w:szCs w:val="18"/>
-                <w:lang w:val="en-GB"/>
-              </w:rPr>
-              <w:t xml:space="preserve"> (constructed): the complement is a place</w:t>
-            </w:r>
-          </w:p>
-        </w:tc>
-      </w:tr>
-    </w:tbl>
-    <w:p>
-      <w:pPr>
-        <w:spacing w:after="160"/>
-        <w:rPr>
-          <w:rFonts w:asciiTheme="majorBidi" w:hAnsiTheme="majorBidi" w:cstheme="majorBidi"/>
-          <w:lang w:val="en-GB"/>
-        </w:rPr>
-      </w:pPr>
     </w:p>
     <w:p>
       <w:pPr>
@@ -8252,7 +8039,6 @@
                 <w:szCs w:val="18"/>
                 <w:lang w:val="en-GB"/>
               </w:rPr>
-              <w:lastRenderedPageBreak/>
               <w:t>A, B</w:t>
             </w:r>
           </w:p>
@@ -8466,7 +8252,16 @@
                 <w:szCs w:val="18"/>
                 <w:lang w:val="en-GB"/>
               </w:rPr>
-              <w:t>The two participants that satisfy §4.3.4.</w:t>
+              <w:t>The two participants that satisfy 4.3.4.</w:t>
+            </w:r>
+            <w:r>
+              <w:rPr>
+                <w:rFonts w:asciiTheme="majorBidi" w:hAnsiTheme="majorBidi" w:cstheme="majorBidi"/>
+                <w:sz w:val="18"/>
+                <w:szCs w:val="18"/>
+                <w:lang w:val="en-GB"/>
+              </w:rPr>
+              <w:t xml:space="preserve"> conditions</w:t>
             </w:r>
           </w:p>
         </w:tc>
@@ -8614,18 +8409,9 @@
       <w:r>
         <w:rPr>
           <w:rFonts w:asciiTheme="majorBidi" w:hAnsiTheme="majorBidi" w:cstheme="majorBidi"/>
-          <w:b/>
-          <w:bCs/>
-          <w:lang w:val="en-GB"/>
-        </w:rPr>
-        <w:t>Agnate realisations.</w:t>
-      </w:r>
-      <w:r>
-        <w:rPr>
-          <w:rFonts w:asciiTheme="majorBidi" w:hAnsiTheme="majorBidi" w:cstheme="majorBidi"/>
-          <w:lang w:val="en-GB"/>
-        </w:rPr>
-        <w:t xml:space="preserve"> A relation can usually be worded in several agnate ways, and coding must not depend on which the writer chose. One case needs an explicit rule because it would otherwise go wrong. In a clause complex, the second clause often expresses what happens to an available participant as a result of the first: </w:t>
+          <w:lang w:val="en-GB"/>
+        </w:rPr>
+        <w:t xml:space="preserve">A relation can usually be worded in several agnate ways, and coding must not depend on which the writer chose. One case needs an explicit rule because it would otherwise go wrong. In a clause complex, the second clause often expresses what happens to an available participant as a result of the first: </w:t>
       </w:r>
       <w:r>
         <w:rPr>
@@ -8650,7 +8436,17 @@
           <w:iCs/>
           <w:lang w:val="en-GB"/>
         </w:rPr>
-        <w:t>this prevents the advantages from being realised</w:t>
+        <w:t xml:space="preserve">this prevents the advantages </w:t>
+      </w:r>
+      <w:r>
+        <w:rPr>
+          <w:rFonts w:asciiTheme="majorBidi" w:hAnsiTheme="majorBidi" w:cstheme="majorBidi"/>
+          <w:i/>
+          <w:iCs/>
+          <w:lang w:val="en-GB"/>
+        </w:rPr>
+        <w:lastRenderedPageBreak/>
+        <w:t>from being realised</w:t>
       </w:r>
       <w:r>
         <w:rPr>
@@ -8771,11 +8567,20 @@
       <w:r>
         <w:rPr>
           <w:rFonts w:asciiTheme="majorBidi" w:hAnsiTheme="majorBidi" w:cstheme="majorBidi"/>
-          <w:i/>
-          <w:iCs/>
-          <w:lang w:val="en-GB"/>
-        </w:rPr>
-        <w:t>Projection.</w:t>
+          <w:b/>
+          <w:bCs/>
+          <w:lang w:val="en-GB"/>
+        </w:rPr>
+        <w:t>Projection</w:t>
+      </w:r>
+      <w:r>
+        <w:rPr>
+          <w:rFonts w:asciiTheme="majorBidi" w:hAnsiTheme="majorBidi" w:cstheme="majorBidi"/>
+          <w:b/>
+          <w:bCs/>
+          <w:lang w:val="en-GB"/>
+        </w:rPr>
+        <w:t>:</w:t>
       </w:r>
       <w:r>
         <w:rPr>
@@ -8796,11 +8601,20 @@
       <w:r>
         <w:rPr>
           <w:rFonts w:asciiTheme="majorBidi" w:hAnsiTheme="majorBidi" w:cstheme="majorBidi"/>
-          <w:i/>
-          <w:iCs/>
-          <w:lang w:val="en-GB"/>
-        </w:rPr>
-        <w:t>Internal conjunction.</w:t>
+          <w:b/>
+          <w:bCs/>
+          <w:lang w:val="en-GB"/>
+        </w:rPr>
+        <w:t>Internal conjunction</w:t>
+      </w:r>
+      <w:r>
+        <w:rPr>
+          <w:rFonts w:asciiTheme="majorBidi" w:hAnsiTheme="majorBidi" w:cstheme="majorBidi"/>
+          <w:b/>
+          <w:bCs/>
+          <w:lang w:val="en-GB"/>
+        </w:rPr>
+        <w:t>:</w:t>
       </w:r>
       <w:r>
         <w:rPr>
@@ -8933,11 +8747,20 @@
       <w:r>
         <w:rPr>
           <w:rFonts w:asciiTheme="majorBidi" w:hAnsiTheme="majorBidi" w:cstheme="majorBidi"/>
-          <w:i/>
-          <w:iCs/>
-          <w:lang w:val="en-GB"/>
-        </w:rPr>
-        <w:t>Reference and lexical cohesion.</w:t>
+          <w:b/>
+          <w:bCs/>
+          <w:lang w:val="en-GB"/>
+        </w:rPr>
+        <w:t>Reference and lexical cohesion</w:t>
+      </w:r>
+      <w:r>
+        <w:rPr>
+          <w:rFonts w:asciiTheme="majorBidi" w:hAnsiTheme="majorBidi" w:cstheme="majorBidi"/>
+          <w:b/>
+          <w:bCs/>
+          <w:lang w:val="en-GB"/>
+        </w:rPr>
+        <w:t>:</w:t>
       </w:r>
       <w:r>
         <w:rPr>
@@ -8990,11 +8813,20 @@
       <w:r>
         <w:rPr>
           <w:rFonts w:asciiTheme="majorBidi" w:hAnsiTheme="majorBidi" w:cstheme="majorBidi"/>
-          <w:i/>
-          <w:iCs/>
-          <w:lang w:val="en-GB"/>
-        </w:rPr>
-        <w:t>Qualifiers of entities.</w:t>
+          <w:b/>
+          <w:bCs/>
+          <w:lang w:val="en-GB"/>
+        </w:rPr>
+        <w:t>Qualifiers of entities</w:t>
+      </w:r>
+      <w:r>
+        <w:rPr>
+          <w:rFonts w:asciiTheme="majorBidi" w:hAnsiTheme="majorBidi" w:cstheme="majorBidi"/>
+          <w:b/>
+          <w:bCs/>
+          <w:lang w:val="en-GB"/>
+        </w:rPr>
+        <w:t>:</w:t>
       </w:r>
       <w:r>
         <w:rPr>
@@ -9181,15 +9013,7 @@
           <w:rFonts w:asciiTheme="majorBidi" w:hAnsiTheme="majorBidi" w:cstheme="majorBidi"/>
           <w:lang w:val="en-GB"/>
         </w:rPr>
-        <w:t xml:space="preserve">. The environment is not needed to decide whether a relation is new, but it is recorded for two reasons. Disagreement between annotators is far more likely in environments D to H, where the condition on terms must be applied, than in A to C; recording it allows disagreements to be located during rule </w:t>
-      </w:r>
-      <w:r>
-        <w:rPr>
-          <w:rFonts w:asciiTheme="majorBidi" w:hAnsiTheme="majorBidi" w:cstheme="majorBidi"/>
-          <w:lang w:val="en-GB"/>
-        </w:rPr>
-        <w:lastRenderedPageBreak/>
-        <w:t>refinement and agreement to be reported separately for the two groups. It also allows discovery to be described by whether it is realised congruently, through conjunction, or metaphorically.</w:t>
+        <w:t>. The environment is not needed to decide whether a relation is new, but it is recorded for two reasons. Disagreement between annotators is far more likely in environments D to H, where the condition on terms must be applied, than in A to C; recording it allows disagreements to be located during rule refinement and agreement to be reported separately for the two groups. It also allows discovery to be described by whether it is realised congruently, through conjunction, or metaphorically.</w:t>
       </w:r>
     </w:p>
     <w:p>
@@ -9286,6 +9110,7 @@
           <w:bCs/>
           <w:lang w:val="en-GB"/>
         </w:rPr>
+        <w:lastRenderedPageBreak/>
         <w:t>2.</w:t>
       </w:r>
       <w:r>
@@ -9643,7 +9468,6 @@
           <w:szCs w:val="25"/>
           <w:lang w:val="en-GB"/>
         </w:rPr>
-        <w:lastRenderedPageBreak/>
         <w:t>5.5 Scope of conjunctions in a list</w:t>
       </w:r>
     </w:p>
@@ -9681,11 +9505,7 @@
     </w:p>
     <w:p>
       <w:pPr>
-        <w:pBdr>
-          <w:left w:val="single" w:sz="14" w:space="0" w:color="7A7A7A"/>
-        </w:pBdr>
-        <w:spacing w:before="120" w:after="180" w:line="276" w:lineRule="auto"/>
-        <w:ind w:left="300" w:right="300"/>
+        <w:spacing w:after="150" w:line="276" w:lineRule="auto"/>
         <w:rPr>
           <w:rFonts w:asciiTheme="majorBidi" w:hAnsiTheme="majorBidi" w:cstheme="majorBidi"/>
           <w:lang w:val="en-GB"/>
@@ -9728,7 +9548,15 @@
           <w:rFonts w:asciiTheme="majorBidi" w:hAnsiTheme="majorBidi" w:cstheme="majorBidi"/>
           <w:lang w:val="en-GB"/>
         </w:rPr>
-        <w:t>The rule is fixed rather than interpretive, so two annotators applying it reach the same result. It is also conservative in the right direction: a connection made only diffusely, at the level of the plan as a whole, is not treated as a specific relation between two particular elements, and if the writer later makes that specific connection in the text, it is correctly recognised as new.</w:t>
+        <w:t xml:space="preserve">The rule is fixed rather than interpretive, so two annotators applying it reach the same result. It is also conservative in the right direction: a connection made only diffusely, at the level of the plan as a whole, is not </w:t>
+      </w:r>
+      <w:r>
+        <w:rPr>
+          <w:rFonts w:asciiTheme="majorBidi" w:hAnsiTheme="majorBidi" w:cstheme="majorBidi"/>
+          <w:lang w:val="en-GB"/>
+        </w:rPr>
+        <w:lastRenderedPageBreak/>
+        <w:t>treated as a specific relation between two particular elements, and if the writer later makes that specific connection in the text, it is correctly recognised as new.</w:t>
       </w:r>
     </w:p>
     <w:p>
@@ -9773,16 +9601,19 @@
     </w:p>
     <w:p>
       <w:pPr>
-        <w:pBdr>
-          <w:left w:val="single" w:sz="14" w:space="0" w:color="7A7A7A"/>
-        </w:pBdr>
-        <w:spacing w:before="120" w:after="180" w:line="276" w:lineRule="auto"/>
-        <w:ind w:left="300" w:right="300"/>
+        <w:spacing w:before="210" w:after="100"/>
         <w:rPr>
           <w:rFonts w:asciiTheme="majorBidi" w:hAnsiTheme="majorBidi" w:cstheme="majorBidi"/>
           <w:lang w:val="en-GB"/>
         </w:rPr>
       </w:pPr>
+      <w:r>
+        <w:rPr>
+          <w:rFonts w:asciiTheme="majorBidi" w:hAnsiTheme="majorBidi" w:cstheme="majorBidi"/>
+          <w:lang w:val="en-GB"/>
+        </w:rPr>
+        <w:t xml:space="preserve">Responding to the task prompt: </w:t>
+      </w:r>
       <w:r>
         <w:rPr>
           <w:rFonts w:asciiTheme="majorBidi" w:hAnsiTheme="majorBidi" w:cstheme="majorBidi"/>
@@ -9791,6 +9622,22 @@
           <w:lang w:val="en-GB"/>
         </w:rPr>
         <w:t>In order to meet someone new to date, it is better for the first couple of dates to be online rather than in real-life.</w:t>
+      </w:r>
+      <w:r>
+        <w:rPr>
+          <w:rFonts w:asciiTheme="majorBidi" w:hAnsiTheme="majorBidi" w:cstheme="majorBidi"/>
+          <w:i/>
+          <w:iCs/>
+          <w:lang w:val="en-GB"/>
+        </w:rPr>
+        <w:t xml:space="preserve"> </w:t>
+      </w:r>
+      <w:r>
+        <w:rPr>
+          <w:rFonts w:asciiTheme="majorBidi" w:hAnsiTheme="majorBidi" w:cstheme="majorBidi"/>
+          <w:lang w:val="en-GB"/>
+        </w:rPr>
+        <w:t>Examples are written by me</w:t>
       </w:r>
     </w:p>
     <w:tbl>
@@ -12096,7 +11943,6 @@
                 <w:szCs w:val="17"/>
                 <w:lang w:val="en-GB"/>
               </w:rPr>
-              <w:lastRenderedPageBreak/>
               <w:t>O10</w:t>
             </w:r>
           </w:p>
@@ -13033,6 +12879,7 @@
                 <w:szCs w:val="17"/>
                 <w:lang w:val="en-GB"/>
               </w:rPr>
+              <w:lastRenderedPageBreak/>
               <w:t>R3</w:t>
             </w:r>
           </w:p>
@@ -14672,7 +14519,6 @@
           <w:iCs/>
           <w:lang w:val="en-GB"/>
         </w:rPr>
-        <w:lastRenderedPageBreak/>
         <w:t>Grammatical metaphor is frequent</w:t>
       </w:r>
     </w:p>
@@ -14825,6 +14671,7 @@
           <w:rFonts w:asciiTheme="majorBidi" w:hAnsiTheme="majorBidi" w:cstheme="majorBidi"/>
           <w:lang w:val="en-GB"/>
         </w:rPr>
+        <w:lastRenderedPageBreak/>
         <w:t>Outline elements that never appear in the text need no special treatment. They remain in the register, and relations to them can still be established later.</w:t>
       </w:r>
     </w:p>
@@ -15244,7 +15091,6 @@
           <w:bCs/>
           <w:lang w:val="en-GB"/>
         </w:rPr>
-        <w:lastRenderedPageBreak/>
         <w:t>Content discovered earlier counts.</w:t>
       </w:r>
       <w:r>
@@ -15532,6 +15378,7 @@
                 <w:szCs w:val="18"/>
                 <w:lang w:val="en-GB"/>
               </w:rPr>
+              <w:lastRenderedPageBreak/>
               <w:t>ELAB</w:t>
             </w:r>
           </w:p>
@@ -16181,7 +16028,6 @@
           <w:rFonts w:asciiTheme="majorBidi" w:hAnsiTheme="majorBidi" w:cstheme="majorBidi"/>
           <w:lang w:val="en-GB"/>
         </w:rPr>
-        <w:lastRenderedPageBreak/>
         <w:t xml:space="preserve">Availability is assessed at the </w:t>
       </w:r>
       <w:r>
@@ -16282,6 +16128,7 @@
           <w:rFonts w:asciiTheme="majorBidi" w:hAnsiTheme="majorBidi" w:cstheme="majorBidi"/>
           <w:lang w:val="en-GB"/>
         </w:rPr>
+        <w:lastRenderedPageBreak/>
         <w:t xml:space="preserve">Positive and negative addition do not produce a new proposition: </w:t>
       </w:r>
       <w:r>
@@ -16875,7 +16722,6 @@
                 <w:szCs w:val="18"/>
                 <w:lang w:val="en-GB"/>
               </w:rPr>
-              <w:lastRenderedPageBreak/>
               <w:t>2. Is it task or outline content not yet realised?</w:t>
             </w:r>
           </w:p>
@@ -17484,6 +17330,7 @@
           <w:szCs w:val="30"/>
           <w:lang w:val="en-GB"/>
         </w:rPr>
+        <w:lastRenderedPageBreak/>
         <w:t>7. Outcomes for analysis</w:t>
       </w:r>
     </w:p>
@@ -18272,7 +18119,6 @@
           <w:szCs w:val="25"/>
           <w:lang w:val="en-GB"/>
         </w:rPr>
-        <w:lastRenderedPageBreak/>
         <w:t>8.3 Relation to prior positions</w:t>
       </w:r>
     </w:p>
@@ -18409,6 +18255,7 @@
           <w:szCs w:val="25"/>
           <w:lang w:val="en-GB"/>
         </w:rPr>
+        <w:lastRenderedPageBreak/>
         <w:t>Example A — a reversed relation, and several exclusions</w:t>
       </w:r>
     </w:p>
@@ -19741,7 +19588,6 @@
                 <w:szCs w:val="17"/>
                 <w:lang w:val="en-GB"/>
               </w:rPr>
-              <w:lastRenderedPageBreak/>
               <w:t>Unit</w:t>
             </w:r>
           </w:p>
@@ -20334,6 +20180,7 @@
           <w:rFonts w:asciiTheme="majorBidi" w:hAnsiTheme="majorBidi" w:cstheme="majorBidi"/>
           <w:lang w:val="en-GB"/>
         </w:rPr>
+        <w:lastRenderedPageBreak/>
         <w:t xml:space="preserve">Discovery: 1. No new content is needed for discovery; the discovery is the relation. The example also shows the scope rule at work: had the outline’s </w:t>
       </w:r>
       <w:r>
@@ -21146,7 +20993,6 @@
                 <w:szCs w:val="17"/>
                 <w:lang w:val="en-GB"/>
               </w:rPr>
-              <w:lastRenderedPageBreak/>
               <w:t>the normalisation and ubiquity of social networking sites</w:t>
             </w:r>
           </w:p>
@@ -21466,6 +21312,7 @@
           <w:iCs/>
           <w:lang w:val="en-GB"/>
         </w:rPr>
+        <w:lastRenderedPageBreak/>
         <w:t>In terms of being online, we refer to digital means of connection, such as through the internet or smartphone applications.</w:t>
       </w:r>
     </w:p>
@@ -21919,25 +21766,41 @@
     </w:p>
     <w:p>
       <w:pPr>
-        <w:pBdr>
-          <w:left w:val="single" w:sz="14" w:space="0" w:color="7A7A7A"/>
-        </w:pBdr>
-        <w:spacing w:before="120" w:after="180" w:line="276" w:lineRule="auto"/>
-        <w:ind w:left="300" w:right="300"/>
-        <w:rPr>
-          <w:rFonts w:asciiTheme="majorBidi" w:hAnsiTheme="majorBidi" w:cstheme="majorBidi"/>
-          <w:lang w:val="en-GB"/>
-        </w:rPr>
-      </w:pPr>
-      <w:r>
+        <w:spacing w:before="280" w:after="130"/>
         <w:rPr>
           <w:rFonts w:asciiTheme="majorBidi" w:hAnsiTheme="majorBidi" w:cstheme="majorBidi"/>
           <w:i/>
           <w:iCs/>
           <w:lang w:val="en-GB"/>
         </w:rPr>
+      </w:pPr>
+    </w:p>
+    <w:p>
+      <w:pPr>
+        <w:spacing w:before="280" w:after="130"/>
+        <w:rPr>
+          <w:rFonts w:asciiTheme="majorBidi" w:hAnsiTheme="majorBidi" w:cstheme="majorBidi"/>
+          <w:lang w:val="en-GB"/>
+        </w:rPr>
+      </w:pPr>
+      <w:r>
+        <w:rPr>
+          <w:rFonts w:asciiTheme="majorBidi" w:hAnsiTheme="majorBidi" w:cstheme="majorBidi"/>
+          <w:i/>
+          <w:iCs/>
+          <w:lang w:val="en-GB"/>
+        </w:rPr>
         <w:t>Meeting people in-person, if one intends to find people to date, also overcomes the previous issue of self-selection bias.</w:t>
       </w:r>
+    </w:p>
+    <w:p>
+      <w:pPr>
+        <w:spacing w:after="150" w:line="276" w:lineRule="auto"/>
+        <w:rPr>
+          <w:rFonts w:asciiTheme="majorBidi" w:hAnsiTheme="majorBidi" w:cstheme="majorBidi"/>
+          <w:lang w:val="en-GB"/>
+        </w:rPr>
+      </w:pPr>
     </w:p>
     <w:p>
       <w:pPr>
@@ -22206,7 +22069,6 @@
           <w:rFonts w:asciiTheme="majorBidi" w:hAnsiTheme="majorBidi" w:cstheme="majorBidi"/>
           <w:lang w:val="en-GB"/>
         </w:rPr>
-        <w:lastRenderedPageBreak/>
         <w:t>Before the main annotation, both annotators work through two pilot transcripts and the rules are refined, with particular attention to the condition on terms, the agnation rule and relation type. The rules are then fixed. Agreement is reported on the main annotation only. Disagreements are resolved by discussion and the resolved annotation is used in the analysis; the independent annotations are retained.</w:t>
       </w:r>
     </w:p>
@@ -22376,6 +22238,7 @@
                 <w:szCs w:val="18"/>
                 <w:lang w:val="en-GB"/>
               </w:rPr>
+              <w:lastRenderedPageBreak/>
               <w:t>1</w:t>
             </w:r>
           </w:p>
@@ -23730,7 +23593,6 @@
           <w:szCs w:val="20"/>
           <w:lang w:val="en-GB"/>
         </w:rPr>
-        <w:lastRenderedPageBreak/>
         <w:t xml:space="preserve">Wengelin, Å. (2006). Examining pauses in writing: Theory, methods and empirical data. In K. P. H. Sullivan &amp; E. Lindgren (Eds.), </w:t>
       </w:r>
       <w:r>
@@ -23794,7 +23656,7 @@
       </w:r>
     </w:p>
     <w:sectPr>
-      <w:footerReference w:type="default" r:id="rId12"/>
+      <w:footerReference w:type="default" r:id="rId13"/>
       <w:pgSz w:w="11906" w:h="16838"/>
       <w:pgMar w:top="1150" w:right="1100" w:bottom="1150" w:left="1100" w:header="708" w:footer="708" w:gutter="0"/>
       <w:cols w:space="720"/>
@@ -23981,11 +23843,127 @@
       </w:pPr>
     </w:lvl>
   </w:abstractNum>
+  <w:abstractNum w:abstractNumId="1" w15:restartNumberingAfterBreak="0">
+    <w:nsid w:val="6176494A"/>
+    <w:multiLevelType w:val="hybridMultilevel"/>
+    <w:tmpl w:val="DA546150"/>
+    <w:lvl w:ilvl="0" w:tplc="041D0001">
+      <w:start w:val="1"/>
+      <w:numFmt w:val="bullet"/>
+      <w:lvlText w:val=""/>
+      <w:lvlJc w:val="left"/>
+      <w:pPr>
+        <w:ind w:left="720" w:hanging="360"/>
+      </w:pPr>
+      <w:rPr>
+        <w:rFonts w:ascii="Symbol" w:hAnsi="Symbol" w:hint="default"/>
+      </w:rPr>
+    </w:lvl>
+    <w:lvl w:ilvl="1" w:tplc="041D0003" w:tentative="1">
+      <w:start w:val="1"/>
+      <w:numFmt w:val="bullet"/>
+      <w:lvlText w:val="o"/>
+      <w:lvlJc w:val="left"/>
+      <w:pPr>
+        <w:ind w:left="1440" w:hanging="360"/>
+      </w:pPr>
+      <w:rPr>
+        <w:rFonts w:ascii="Courier New" w:hAnsi="Courier New" w:cs="Courier New" w:hint="default"/>
+      </w:rPr>
+    </w:lvl>
+    <w:lvl w:ilvl="2" w:tplc="041D0005" w:tentative="1">
+      <w:start w:val="1"/>
+      <w:numFmt w:val="bullet"/>
+      <w:lvlText w:val=""/>
+      <w:lvlJc w:val="left"/>
+      <w:pPr>
+        <w:ind w:left="2160" w:hanging="360"/>
+      </w:pPr>
+      <w:rPr>
+        <w:rFonts w:ascii="Wingdings" w:hAnsi="Wingdings" w:hint="default"/>
+      </w:rPr>
+    </w:lvl>
+    <w:lvl w:ilvl="3" w:tplc="041D0001" w:tentative="1">
+      <w:start w:val="1"/>
+      <w:numFmt w:val="bullet"/>
+      <w:lvlText w:val=""/>
+      <w:lvlJc w:val="left"/>
+      <w:pPr>
+        <w:ind w:left="2880" w:hanging="360"/>
+      </w:pPr>
+      <w:rPr>
+        <w:rFonts w:ascii="Symbol" w:hAnsi="Symbol" w:hint="default"/>
+      </w:rPr>
+    </w:lvl>
+    <w:lvl w:ilvl="4" w:tplc="041D0003" w:tentative="1">
+      <w:start w:val="1"/>
+      <w:numFmt w:val="bullet"/>
+      <w:lvlText w:val="o"/>
+      <w:lvlJc w:val="left"/>
+      <w:pPr>
+        <w:ind w:left="3600" w:hanging="360"/>
+      </w:pPr>
+      <w:rPr>
+        <w:rFonts w:ascii="Courier New" w:hAnsi="Courier New" w:cs="Courier New" w:hint="default"/>
+      </w:rPr>
+    </w:lvl>
+    <w:lvl w:ilvl="5" w:tplc="041D0005" w:tentative="1">
+      <w:start w:val="1"/>
+      <w:numFmt w:val="bullet"/>
+      <w:lvlText w:val=""/>
+      <w:lvlJc w:val="left"/>
+      <w:pPr>
+        <w:ind w:left="4320" w:hanging="360"/>
+      </w:pPr>
+      <w:rPr>
+        <w:rFonts w:ascii="Wingdings" w:hAnsi="Wingdings" w:hint="default"/>
+      </w:rPr>
+    </w:lvl>
+    <w:lvl w:ilvl="6" w:tplc="041D0001" w:tentative="1">
+      <w:start w:val="1"/>
+      <w:numFmt w:val="bullet"/>
+      <w:lvlText w:val=""/>
+      <w:lvlJc w:val="left"/>
+      <w:pPr>
+        <w:ind w:left="5040" w:hanging="360"/>
+      </w:pPr>
+      <w:rPr>
+        <w:rFonts w:ascii="Symbol" w:hAnsi="Symbol" w:hint="default"/>
+      </w:rPr>
+    </w:lvl>
+    <w:lvl w:ilvl="7" w:tplc="041D0003" w:tentative="1">
+      <w:start w:val="1"/>
+      <w:numFmt w:val="bullet"/>
+      <w:lvlText w:val="o"/>
+      <w:lvlJc w:val="left"/>
+      <w:pPr>
+        <w:ind w:left="5760" w:hanging="360"/>
+      </w:pPr>
+      <w:rPr>
+        <w:rFonts w:ascii="Courier New" w:hAnsi="Courier New" w:cs="Courier New" w:hint="default"/>
+      </w:rPr>
+    </w:lvl>
+    <w:lvl w:ilvl="8" w:tplc="041D0005" w:tentative="1">
+      <w:start w:val="1"/>
+      <w:numFmt w:val="bullet"/>
+      <w:lvlText w:val=""/>
+      <w:lvlJc w:val="left"/>
+      <w:pPr>
+        <w:ind w:left="6480" w:hanging="360"/>
+      </w:pPr>
+      <w:rPr>
+        <w:rFonts w:ascii="Wingdings" w:hAnsi="Wingdings" w:hint="default"/>
+      </w:rPr>
+    </w:lvl>
+  </w:abstractNum>
   <w:num w:numId="1" w16cid:durableId="183055631">
     <w:abstractNumId w:val="0"/>
     <w:lvlOverride w:ilvl="0">
       <w:startOverride w:val="1"/>
     </w:lvlOverride>
+  </w:num>
+  <w:num w:numId="2" w16cid:durableId="340014722">
+    <w:abstractNumId w:val="1"/>
   </w:num>
 </w:numbering>
 </file>
@@ -25713,7 +25691,7 @@
   <dgm:whole/>
   <dgm:extLst>
     <a:ext uri="http://schemas.microsoft.com/office/drawing/2008/diagram">
-      <dsp:dataModelExt xmlns:dsp="http://schemas.microsoft.com/office/drawing/2008/diagram" relId="rId11" minVer="http://schemas.openxmlformats.org/drawingml/2006/diagram"/>
+      <dsp:dataModelExt xmlns:dsp="http://schemas.microsoft.com/office/drawing/2008/diagram" relId="rId12" minVer="http://schemas.openxmlformats.org/drawingml/2006/diagram"/>
     </a:ext>
   </dgm:extLst>
 </dgm:dataModel>
@@ -27855,4 +27833,16 @@
     </a:ext>
   </a:extLst>
 </a:theme>
+</file>
+
+<file path=customXml/item1.xml><?xml version="1.0" encoding="utf-8"?>
+<b:Sources xmlns:b="http://schemas.openxmlformats.org/officeDocument/2006/bibliography" xmlns="http://schemas.openxmlformats.org/officeDocument/2006/bibliography" SelectedStyle="\APASixthEditionOfficeOnline.xsl" StyleName="APA" Version="6"/>
+</file>
+
+<file path=customXml/itemProps1.xml><?xml version="1.0" encoding="utf-8"?>
+<ds:datastoreItem xmlns:ds="http://schemas.openxmlformats.org/officeDocument/2006/customXml" ds:itemID="{B74B2FA0-2601-446E-AB92-BF71B560F428}">
+  <ds:schemaRefs>
+    <ds:schemaRef ds:uri="http://schemas.openxmlformats.org/officeDocument/2006/bibliography"/>
+  </ds:schemaRefs>
+</ds:datastoreItem>
 </file>
</xml_diff>